<commit_message>
16/02/2026 - 21:00 h
</commit_message>
<xml_diff>
--- a/Estudo de O Livro dos Espíritos - 23-02-2026.docx
+++ b/Estudo de O Livro dos Espíritos - 23-02-2026.docx
@@ -962,7 +962,33 @@
           <w:szCs w:val="36"/>
           <w:lang w:val="pt-BR" w:eastAsia="zh-CN" w:bidi="hi-IN"/>
         </w:rPr>
-        <w:t>Próximo de completar 30 anos, meu corpo começa a manifestar os sintomas da doença. Eu começo a ficar preocupado e, como trago na consciência a lembrança de que aquilo iria acontecer, também sinto medo, a tal ponto de não procurar um médico, com receio de que o diagnóstico se confirme.</w:t>
+        <w:t xml:space="preserve">Próximo de completar 30 anos, meu corpo começa a manifestar os sintomas da doença. Eu começo a ficar preocupado e, como trago na consciência a lembrança de que aquilo </w:t>
+      </w:r>
+      <w:r>
+        <w:rPr>
+          <w:rFonts w:eastAsia="Noto Serif CJK SC" w:cs="Noto Sans Devanagari" w:ascii="Garamond" w:hAnsi="Garamond"/>
+          <w:i w:val="false"/>
+          <w:iCs w:val="false"/>
+          <w:color w:val="00A0FC"/>
+          <w:kern w:val="2"/>
+          <w:sz w:val="36"/>
+          <w:szCs w:val="36"/>
+          <w:lang w:val="pt-BR" w:eastAsia="zh-CN" w:bidi="hi-IN"/>
+        </w:rPr>
+        <w:t>vai</w:t>
+      </w:r>
+      <w:r>
+        <w:rPr>
+          <w:rFonts w:eastAsia="Noto Serif CJK SC" w:cs="Noto Sans Devanagari" w:ascii="Garamond" w:hAnsi="Garamond"/>
+          <w:i w:val="false"/>
+          <w:iCs w:val="false"/>
+          <w:color w:val="00A0FC"/>
+          <w:kern w:val="2"/>
+          <w:sz w:val="36"/>
+          <w:szCs w:val="36"/>
+          <w:lang w:val="pt-BR" w:eastAsia="zh-CN" w:bidi="hi-IN"/>
+        </w:rPr>
+        <w:t xml:space="preserve"> acontecer, também sinto medo, a tal ponto de não procurar um médico, com receio de que o diagnóstico se confirme.</w:t>
       </w:r>
     </w:p>
     <w:p>
@@ -2885,7 +2911,7 @@
           <w:szCs w:val="36"/>
           <w:lang w:val="pt-BR" w:eastAsia="zh-CN" w:bidi="hi-IN"/>
         </w:rPr>
-        <w:t>Na nota que Kardec acrescentou à essa questão, ele diz que nós temos o péssimo hábito de pensar que a assistência espiritual chegará através de milagres e eventos espetaculares. Como não é dessa forma que os Espíritos atuam, o auxílio que eles nos prestam muitas vezes passam despercebidos por nós.</w:t>
+        <w:t>Na nota que Kardec acrescentou à essa questão, ele diz que nós temos o péssimo hábito de pensar que a assistência espiritual chegará através de milagres e eventos espetaculares. Como não é dessa forma que os Espíritos atuam, o auxílio que eles nos prestam muitas vezes passa despercebido por nós.</w:t>
       </w:r>
     </w:p>
     <w:p>
@@ -3406,28 +3432,33 @@
           <w:szCs w:val="36"/>
           <w:lang w:val="pt-BR" w:eastAsia="zh-CN" w:bidi="hi-IN"/>
         </w:rPr>
-        <w:t>Ao chegar ao plano espiritual, encontrou-se com Deus (ou com um anjo, dependendo da versão) e perguntou, decepcionado:</w:t>
-      </w:r>
-    </w:p>
-    <w:p>
-      <w:pPr>
-        <w:pStyle w:val="Normal"/>
-        <w:bidi w:val="0"/>
-        <w:ind w:left="709" w:hanging="0"/>
-        <w:jc w:val="both"/>
-        <w:rPr>
-          <w:i/>
+        <w:t xml:space="preserve">Ao chegar ao plano espiritual, encontrou-se com </w:t>
+      </w:r>
+      <w:r>
+        <w:rPr>
+          <w:rFonts w:eastAsia="Noto Serif CJK SC" w:cs="Noto Sans Devanagari" w:ascii="Garamond" w:hAnsi="Garamond"/>
           <w:i/>
           <w:iCs/>
           <w:color w:val="622502"/>
-        </w:rPr>
-      </w:pPr>
-      <w:r>
-        <w:rPr>
+          <w:kern w:val="2"/>
+          <w:sz w:val="36"/>
+          <w:szCs w:val="36"/>
+          <w:lang w:val="pt-BR" w:eastAsia="zh-CN" w:bidi="hi-IN"/>
+        </w:rPr>
+        <w:t>o anjo</w:t>
+      </w:r>
+      <w:r>
+        <w:rPr>
+          <w:rFonts w:eastAsia="Noto Serif CJK SC" w:cs="Noto Sans Devanagari" w:ascii="Garamond" w:hAnsi="Garamond"/>
           <w:i/>
           <w:iCs/>
           <w:color w:val="622502"/>
-        </w:rPr>
+          <w:kern w:val="2"/>
+          <w:sz w:val="36"/>
+          <w:szCs w:val="36"/>
+          <w:lang w:val="pt-BR" w:eastAsia="zh-CN" w:bidi="hi-IN"/>
+        </w:rPr>
+        <w:t xml:space="preserve"> e perguntou, decepcionado:</w:t>
       </w:r>
     </w:p>
     <w:p>
@@ -3445,10 +3476,31 @@
       </w:pPr>
       <w:r>
         <w:rPr>
-          <w:rFonts w:eastAsia="Noto Serif CJK SC" w:cs="Noto Sans Devanagari" w:ascii="Garamond" w:hAnsi="Garamond"/>
           <w:i/>
           <w:iCs/>
           <w:color w:val="622502"/>
+        </w:rPr>
+      </w:r>
+    </w:p>
+    <w:p>
+      <w:pPr>
+        <w:pStyle w:val="Normal"/>
+        <w:bidi w:val="0"/>
+        <w:ind w:left="709" w:hanging="0"/>
+        <w:jc w:val="both"/>
+        <w:rPr>
+          <w:i/>
+          <w:i/>
+          <w:iCs/>
+          <w:color w:val="622502"/>
+        </w:rPr>
+      </w:pPr>
+      <w:r>
+        <w:rPr>
+          <w:rFonts w:eastAsia="Noto Serif CJK SC" w:cs="Noto Sans Devanagari" w:ascii="Garamond" w:hAnsi="Garamond"/>
+          <w:i/>
+          <w:iCs/>
+          <w:color w:val="622502"/>
           <w:kern w:val="2"/>
           <w:sz w:val="36"/>
           <w:szCs w:val="36"/>
@@ -3467,49 +3519,62 @@
           <w:szCs w:val="36"/>
           <w:lang w:val="pt-BR" w:eastAsia="zh-CN" w:bidi="hi-IN"/>
         </w:rPr>
-        <w:t>Senhor, eu confiei em Ti. Por que não me salvaste?</w:t>
-      </w:r>
-    </w:p>
-    <w:p>
-      <w:pPr>
-        <w:pStyle w:val="Normal"/>
-        <w:bidi w:val="0"/>
-        <w:ind w:left="709" w:hanging="0"/>
-        <w:jc w:val="both"/>
-        <w:rPr>
-          <w:i/>
+        <w:t>E</w:t>
+      </w:r>
+      <w:r>
+        <w:rPr>
+          <w:rFonts w:eastAsia="Noto Serif CJK SC" w:cs="Noto Sans Devanagari" w:ascii="Garamond" w:hAnsi="Garamond"/>
           <w:i/>
           <w:iCs/>
           <w:color w:val="622502"/>
-        </w:rPr>
-      </w:pPr>
-      <w:r>
-        <w:rPr>
+          <w:kern w:val="2"/>
+          <w:sz w:val="36"/>
+          <w:szCs w:val="36"/>
+          <w:lang w:val="pt-BR" w:eastAsia="zh-CN" w:bidi="hi-IN"/>
+        </w:rPr>
+        <w:t>u confiei em Ti. Por que não me salvaste?</w:t>
+      </w:r>
+    </w:p>
+    <w:p>
+      <w:pPr>
+        <w:pStyle w:val="Normal"/>
+        <w:bidi w:val="0"/>
+        <w:ind w:left="709" w:hanging="0"/>
+        <w:jc w:val="both"/>
+        <w:rPr>
+          <w:i/>
           <w:i/>
           <w:iCs/>
           <w:color w:val="622502"/>
         </w:rPr>
-      </w:r>
-    </w:p>
-    <w:p>
-      <w:pPr>
-        <w:pStyle w:val="Normal"/>
-        <w:bidi w:val="0"/>
-        <w:ind w:left="709" w:hanging="0"/>
-        <w:jc w:val="both"/>
-        <w:rPr>
-          <w:i/>
+      </w:pPr>
+      <w:r>
+        <w:rPr>
           <w:i/>
           <w:iCs/>
           <w:color w:val="622502"/>
         </w:rPr>
-      </w:pPr>
-      <w:r>
-        <w:rPr>
-          <w:rFonts w:eastAsia="Noto Serif CJK SC" w:cs="Noto Sans Devanagari" w:ascii="Garamond" w:hAnsi="Garamond"/>
+      </w:r>
+    </w:p>
+    <w:p>
+      <w:pPr>
+        <w:pStyle w:val="Normal"/>
+        <w:bidi w:val="0"/>
+        <w:ind w:left="709" w:hanging="0"/>
+        <w:jc w:val="both"/>
+        <w:rPr>
+          <w:i/>
           <w:i/>
           <w:iCs/>
           <w:color w:val="622502"/>
+        </w:rPr>
+      </w:pPr>
+      <w:r>
+        <w:rPr>
+          <w:rFonts w:eastAsia="Noto Serif CJK SC" w:cs="Noto Sans Devanagari" w:ascii="Garamond" w:hAnsi="Garamond"/>
+          <w:i/>
+          <w:iCs/>
+          <w:color w:val="622502"/>
           <w:kern w:val="2"/>
           <w:sz w:val="36"/>
           <w:szCs w:val="36"/>
@@ -3625,7 +3690,7 @@
           <w:szCs w:val="36"/>
           <w:lang w:val="pt-BR" w:eastAsia="zh-CN" w:bidi="hi-IN"/>
         </w:rPr>
-        <w:t>Ou seja: Deus, através do Espíritos, nos envia mil diferentes formas de amparo, mas como ficamos aguardando as apresentações milagrosas para sermos ajudados, acabamos perdendo a oportunidade de sermos ajudados.</w:t>
+        <w:t>Ou seja: Deus, através do Espíritos, nos envia mil diferentes formas de amparo, mas como ficamos aguardando as apresentações milagrosas, acabamos perdendo a oportunidade de sermos ajudados.</w:t>
       </w:r>
     </w:p>
     <w:p>
@@ -3761,25 +3826,6 @@
       </w:pPr>
       <w:r>
         <w:rPr>
-          <w:rFonts w:ascii="Garamond" w:hAnsi="Garamond"/>
-          <w:sz w:val="36"/>
-          <w:szCs w:val="36"/>
-        </w:rPr>
-      </w:r>
-    </w:p>
-    <w:p>
-      <w:pPr>
-        <w:pStyle w:val="Normal"/>
-        <w:bidi w:val="0"/>
-        <w:jc w:val="both"/>
-        <w:rPr>
-          <w:rFonts w:ascii="Garamond" w:hAnsi="Garamond"/>
-          <w:sz w:val="36"/>
-          <w:szCs w:val="36"/>
-        </w:rPr>
-      </w:pPr>
-      <w:r>
-        <w:rPr>
           <w:rFonts w:eastAsia="Noto Serif CJK SC" w:cs="Noto Sans Devanagari" w:ascii="Garamond" w:hAnsi="Garamond"/>
           <w:color w:val="auto"/>
           <w:kern w:val="2"/>
@@ -4199,7 +4245,72 @@
           <w:szCs w:val="36"/>
           <w:lang w:val="pt-BR" w:eastAsia="zh-CN" w:bidi="hi-IN"/>
         </w:rPr>
-        <w:t>Os Espíritos não “realizariam um milagre”, danificando a escada — que estaria em boas condições e seria forte o suficiente para suportar o peso do homem — para que ela se quebrasse justamente quando ele subisse nela.</w:t>
+        <w:t>Se a escada estivesse em boas condições e fosse forte o bastante para suportar o peso do homem, o</w:t>
+      </w:r>
+      <w:r>
+        <w:rPr>
+          <w:rFonts w:eastAsia="Noto Serif CJK SC" w:cs="Noto Sans Devanagari" w:ascii="Garamond" w:hAnsi="Garamond"/>
+          <w:i w:val="false"/>
+          <w:iCs w:val="false"/>
+          <w:color w:val="00A0FC"/>
+          <w:kern w:val="2"/>
+          <w:sz w:val="36"/>
+          <w:szCs w:val="36"/>
+          <w:lang w:val="pt-BR" w:eastAsia="zh-CN" w:bidi="hi-IN"/>
+        </w:rPr>
+        <w:t>s Espíritos não “realizariam um milagre”</w:t>
+      </w:r>
+      <w:r>
+        <w:rPr>
+          <w:rFonts w:eastAsia="Noto Serif CJK SC" w:cs="Noto Sans Devanagari" w:ascii="Garamond" w:hAnsi="Garamond"/>
+          <w:i w:val="false"/>
+          <w:iCs w:val="false"/>
+          <w:color w:val="00A0FC"/>
+          <w:kern w:val="2"/>
+          <w:sz w:val="36"/>
+          <w:szCs w:val="36"/>
+          <w:lang w:val="pt-BR" w:eastAsia="zh-CN" w:bidi="hi-IN"/>
+        </w:rPr>
+        <w:t xml:space="preserve"> </w:t>
+      </w:r>
+      <w:r>
+        <w:rPr>
+          <w:rFonts w:eastAsia="Noto Serif CJK SC" w:cs="Noto Sans Devanagari" w:ascii="Garamond" w:hAnsi="Garamond"/>
+          <w:i w:val="false"/>
+          <w:iCs w:val="false"/>
+          <w:color w:val="00A0FC"/>
+          <w:kern w:val="2"/>
+          <w:sz w:val="36"/>
+          <w:szCs w:val="36"/>
+          <w:lang w:val="pt-BR" w:eastAsia="zh-CN" w:bidi="hi-IN"/>
+        </w:rPr>
+        <w:t xml:space="preserve"> danificando a escada para que ela se quebrasse </w:t>
+      </w:r>
+      <w:r>
+        <w:rPr>
+          <w:rFonts w:eastAsia="Noto Serif CJK SC" w:cs="Noto Sans Devanagari" w:ascii="Garamond" w:hAnsi="Garamond"/>
+          <w:i w:val="false"/>
+          <w:iCs w:val="false"/>
+          <w:color w:val="00A0FC"/>
+          <w:kern w:val="2"/>
+          <w:sz w:val="36"/>
+          <w:szCs w:val="36"/>
+          <w:lang w:val="pt-BR" w:eastAsia="zh-CN" w:bidi="hi-IN"/>
+        </w:rPr>
+        <w:t xml:space="preserve">quando o homem </w:t>
+      </w:r>
+      <w:r>
+        <w:rPr>
+          <w:rFonts w:eastAsia="Noto Serif CJK SC" w:cs="Noto Sans Devanagari" w:ascii="Garamond" w:hAnsi="Garamond"/>
+          <w:i w:val="false"/>
+          <w:iCs w:val="false"/>
+          <w:color w:val="00A0FC"/>
+          <w:kern w:val="2"/>
+          <w:sz w:val="36"/>
+          <w:szCs w:val="36"/>
+          <w:lang w:val="pt-BR" w:eastAsia="zh-CN" w:bidi="hi-IN"/>
+        </w:rPr>
+        <w:t>subisse nela.</w:t>
       </w:r>
     </w:p>
     <w:p>
@@ -4346,7 +4457,59 @@
           <w:szCs w:val="36"/>
           <w:lang w:val="pt-BR" w:eastAsia="zh-CN" w:bidi="hi-IN"/>
         </w:rPr>
-        <w:t>Em A Gênese, no capítulo XIV — Os Fluidos —, Kardec nos explica que todas as formas de matéria que conhecemos na Terra têm como origem o chamado Fluido Cósmico Universal.</w:t>
+        <w:t xml:space="preserve">Em A Gênese, no capítulo XIV — Os Fluidos —, Kardec nos explica que todas as formas de matéria que conhecemos na Terra têm </w:t>
+      </w:r>
+      <w:r>
+        <w:rPr>
+          <w:rFonts w:eastAsia="Noto Serif CJK SC" w:cs="Noto Sans Devanagari" w:ascii="Garamond" w:hAnsi="Garamond"/>
+          <w:i w:val="false"/>
+          <w:iCs w:val="false"/>
+          <w:color w:val="00A0FC"/>
+          <w:kern w:val="2"/>
+          <w:sz w:val="36"/>
+          <w:szCs w:val="36"/>
+          <w:lang w:val="pt-BR" w:eastAsia="zh-CN" w:bidi="hi-IN"/>
+        </w:rPr>
+        <w:t>sua</w:t>
+      </w:r>
+      <w:r>
+        <w:rPr>
+          <w:rFonts w:eastAsia="Noto Serif CJK SC" w:cs="Noto Sans Devanagari" w:ascii="Garamond" w:hAnsi="Garamond"/>
+          <w:i w:val="false"/>
+          <w:iCs w:val="false"/>
+          <w:color w:val="00A0FC"/>
+          <w:kern w:val="2"/>
+          <w:sz w:val="36"/>
+          <w:szCs w:val="36"/>
+          <w:lang w:val="pt-BR" w:eastAsia="zh-CN" w:bidi="hi-IN"/>
+        </w:rPr>
+        <w:t xml:space="preserve"> origem </w:t>
+      </w:r>
+      <w:r>
+        <w:rPr>
+          <w:rFonts w:eastAsia="Noto Serif CJK SC" w:cs="Noto Sans Devanagari" w:ascii="Garamond" w:hAnsi="Garamond"/>
+          <w:i w:val="false"/>
+          <w:iCs w:val="false"/>
+          <w:color w:val="00A0FC"/>
+          <w:kern w:val="2"/>
+          <w:sz w:val="36"/>
+          <w:szCs w:val="36"/>
+          <w:lang w:val="pt-BR" w:eastAsia="zh-CN" w:bidi="hi-IN"/>
+        </w:rPr>
+        <w:t>n</w:t>
+      </w:r>
+      <w:r>
+        <w:rPr>
+          <w:rFonts w:eastAsia="Noto Serif CJK SC" w:cs="Noto Sans Devanagari" w:ascii="Garamond" w:hAnsi="Garamond"/>
+          <w:i w:val="false"/>
+          <w:iCs w:val="false"/>
+          <w:color w:val="00A0FC"/>
+          <w:kern w:val="2"/>
+          <w:sz w:val="36"/>
+          <w:szCs w:val="36"/>
+          <w:lang w:val="pt-BR" w:eastAsia="zh-CN" w:bidi="hi-IN"/>
+        </w:rPr>
+        <w:t>o chamado Fluido Cósmico Universal.</w:t>
       </w:r>
     </w:p>
     <w:p>
@@ -4444,7 +4607,90 @@
           <w:szCs w:val="36"/>
           <w:lang w:val="pt-BR" w:eastAsia="zh-CN" w:bidi="hi-IN"/>
         </w:rPr>
-        <w:t>Ele funciona como o meio intermediário pelo qual o Espírito atua sobre a matéria, podendo assumir diferentes propriedades conforme as combinações, transformações e a ação da vontade e do pensamento dos Espíritos. Essa ação da vontade e do pensamento dos Espíritos é a parte que nos interessa aqui.</w:t>
+        <w:t xml:space="preserve">Ele funciona como o meio intermediário pelo qual o Espírito atua sobre a matéria, podendo assumir diferentes propriedades conforme as combinações, transformações e a ação da vontade e do pensamento dos Espíritos. </w:t>
+      </w:r>
+    </w:p>
+    <w:p>
+      <w:pPr>
+        <w:pStyle w:val="Normal"/>
+        <w:bidi w:val="0"/>
+        <w:ind w:left="709" w:hanging="0"/>
+        <w:jc w:val="both"/>
+        <w:rPr>
+          <w:rFonts w:ascii="Garamond" w:hAnsi="Garamond"/>
+          <w:color w:val="00A0FC"/>
+          <w:sz w:val="36"/>
+          <w:szCs w:val="36"/>
+        </w:rPr>
+      </w:pPr>
+      <w:r>
+        <w:rPr/>
+      </w:r>
+    </w:p>
+    <w:p>
+      <w:pPr>
+        <w:pStyle w:val="Normal"/>
+        <w:bidi w:val="0"/>
+        <w:ind w:left="709" w:hanging="0"/>
+        <w:jc w:val="both"/>
+        <w:rPr>
+          <w:rFonts w:ascii="Garamond" w:hAnsi="Garamond"/>
+          <w:color w:val="00A0FC"/>
+          <w:sz w:val="36"/>
+          <w:szCs w:val="36"/>
+        </w:rPr>
+      </w:pPr>
+      <w:r>
+        <w:rPr>
+          <w:rFonts w:eastAsia="Noto Serif CJK SC" w:cs="Noto Sans Devanagari" w:ascii="Garamond" w:hAnsi="Garamond"/>
+          <w:i w:val="false"/>
+          <w:iCs w:val="false"/>
+          <w:color w:val="00A0FC"/>
+          <w:kern w:val="2"/>
+          <w:sz w:val="36"/>
+          <w:szCs w:val="36"/>
+          <w:lang w:val="pt-BR" w:eastAsia="zh-CN" w:bidi="hi-IN"/>
+        </w:rPr>
+        <w:t>É justamente a</w:t>
+      </w:r>
+      <w:r>
+        <w:rPr>
+          <w:rFonts w:eastAsia="Noto Serif CJK SC" w:cs="Noto Sans Devanagari" w:ascii="Garamond" w:hAnsi="Garamond"/>
+          <w:i w:val="false"/>
+          <w:iCs w:val="false"/>
+          <w:color w:val="00A0FC"/>
+          <w:kern w:val="2"/>
+          <w:sz w:val="36"/>
+          <w:szCs w:val="36"/>
+          <w:lang w:val="pt-BR" w:eastAsia="zh-CN" w:bidi="hi-IN"/>
+        </w:rPr>
+        <w:t xml:space="preserve"> ação da vontade e do pensamento dos Espíritos </w:t>
+      </w:r>
+      <w:r>
+        <w:rPr>
+          <w:rFonts w:eastAsia="Noto Serif CJK SC" w:cs="Noto Sans Devanagari" w:ascii="Garamond" w:hAnsi="Garamond"/>
+          <w:i w:val="false"/>
+          <w:iCs w:val="false"/>
+          <w:color w:val="00A0FC"/>
+          <w:kern w:val="2"/>
+          <w:sz w:val="36"/>
+          <w:szCs w:val="36"/>
+          <w:lang w:val="pt-BR" w:eastAsia="zh-CN" w:bidi="hi-IN"/>
+        </w:rPr>
+        <w:t>q</w:t>
+      </w:r>
+      <w:r>
+        <w:rPr>
+          <w:rFonts w:eastAsia="Noto Serif CJK SC" w:cs="Noto Sans Devanagari" w:ascii="Garamond" w:hAnsi="Garamond"/>
+          <w:i w:val="false"/>
+          <w:iCs w:val="false"/>
+          <w:color w:val="00A0FC"/>
+          <w:kern w:val="2"/>
+          <w:sz w:val="36"/>
+          <w:szCs w:val="36"/>
+          <w:lang w:val="pt-BR" w:eastAsia="zh-CN" w:bidi="hi-IN"/>
+        </w:rPr>
+        <w:t>ue nos interessa aqui.</w:t>
       </w:r>
     </w:p>
     <w:p>
@@ -4636,52 +4882,74 @@
           <w:sz w:val="36"/>
           <w:szCs w:val="36"/>
         </w:rPr>
-        <w:t>Kardec ainda nos explica que, por meio do seu perispírito é que o Espírito atuava sobre o seu corpo vivo quando encarnado. Após o desencane, é ainda por intermédio desse mesmo fluido que ele se manifesta.</w:t>
-      </w:r>
-    </w:p>
-    <w:p>
-      <w:pPr>
-        <w:pStyle w:val="Normal"/>
-        <w:bidi w:val="0"/>
-        <w:ind w:left="709" w:hanging="0"/>
-        <w:jc w:val="both"/>
-        <w:rPr>
-          <w:rFonts w:ascii="Garamond" w:hAnsi="Garamond"/>
-          <w:color w:val="00A0FC"/>
-          <w:sz w:val="36"/>
-          <w:szCs w:val="36"/>
-        </w:rPr>
-      </w:pPr>
-      <w:r>
-        <w:rPr>
-          <w:rFonts w:ascii="Garamond" w:hAnsi="Garamond"/>
-          <w:color w:val="00A0FC"/>
-          <w:sz w:val="36"/>
-          <w:szCs w:val="36"/>
-        </w:rPr>
-      </w:r>
-    </w:p>
-    <w:p>
-      <w:pPr>
-        <w:pStyle w:val="Normal"/>
-        <w:bidi w:val="0"/>
-        <w:ind w:left="709" w:hanging="0"/>
-        <w:jc w:val="both"/>
-        <w:rPr>
-          <w:rFonts w:ascii="Garamond" w:hAnsi="Garamond"/>
-          <w:color w:val="00A0FC"/>
-          <w:sz w:val="36"/>
-          <w:szCs w:val="36"/>
-        </w:rPr>
-      </w:pPr>
-      <w:r>
-        <w:rPr>
-          <w:rFonts w:ascii="Garamond" w:hAnsi="Garamond"/>
-          <w:color w:val="00A0FC"/>
-          <w:sz w:val="36"/>
-          <w:szCs w:val="36"/>
-        </w:rPr>
-        <w:t>Atuando sobre a matéria inerte, é que produz ruídos, movimentos de mesa e outros objetos, que os levanta, derriba, ou transporta. Nada tem de surpreendente esse fenômeno, se considerarmos que, entre nós, os mais possantes motores se encontram nos fluidos mais rarefeitos e mesmo imponderáveis, como o ar, o vapor e a eletricidade.</w:t>
+        <w:t>Kardec ainda nos explica que</w:t>
+      </w:r>
+      <w:r>
+        <w:rPr>
+          <w:rFonts w:ascii="Garamond" w:hAnsi="Garamond"/>
+          <w:color w:val="00A0FC"/>
+          <w:sz w:val="36"/>
+          <w:szCs w:val="36"/>
+        </w:rPr>
+        <w:t xml:space="preserve"> o Espírito encarnado atua sobre o corpo físico através do perispírito. Quando desencarnado é também pelo perispírito que o Espírito atua sobre a matéria.</w:t>
+      </w:r>
+    </w:p>
+    <w:p>
+      <w:pPr>
+        <w:pStyle w:val="Normal"/>
+        <w:bidi w:val="0"/>
+        <w:ind w:left="709" w:hanging="0"/>
+        <w:jc w:val="both"/>
+        <w:rPr>
+          <w:rFonts w:ascii="Garamond" w:hAnsi="Garamond"/>
+          <w:color w:val="00A0FC"/>
+          <w:sz w:val="36"/>
+          <w:szCs w:val="36"/>
+        </w:rPr>
+      </w:pPr>
+      <w:r>
+        <w:rPr/>
+      </w:r>
+    </w:p>
+    <w:p>
+      <w:pPr>
+        <w:pStyle w:val="Normal"/>
+        <w:bidi w:val="0"/>
+        <w:ind w:left="709" w:hanging="0"/>
+        <w:jc w:val="both"/>
+        <w:rPr>
+          <w:rFonts w:ascii="Garamond" w:hAnsi="Garamond"/>
+          <w:color w:val="00A0FC"/>
+          <w:sz w:val="36"/>
+          <w:szCs w:val="36"/>
+        </w:rPr>
+      </w:pPr>
+      <w:r>
+        <w:rPr>
+          <w:rFonts w:ascii="Garamond" w:hAnsi="Garamond"/>
+          <w:color w:val="00A0FC"/>
+          <w:sz w:val="36"/>
+          <w:szCs w:val="36"/>
+        </w:rPr>
+        <w:t>Atuando sobre a matéria inerte, é que produz ruídos, movimentos de mesa e outros objetos, que os levanta, derr</w:t>
+      </w:r>
+      <w:r>
+        <w:rPr>
+          <w:rFonts w:ascii="Garamond" w:hAnsi="Garamond"/>
+          <w:color w:val="00A0FC"/>
+          <w:sz w:val="36"/>
+          <w:szCs w:val="36"/>
+        </w:rPr>
+        <w:t>u</w:t>
+      </w:r>
+      <w:r>
+        <w:rPr>
+          <w:rFonts w:ascii="Garamond" w:hAnsi="Garamond"/>
+          <w:color w:val="00A0FC"/>
+          <w:sz w:val="36"/>
+          <w:szCs w:val="36"/>
+        </w:rPr>
+        <w:t>ba, ou transporta. Nada tem de surpreendente esse fenômeno, se considerarmos que, entre nós, os mais possantes motores se encontram nos fluidos mais rarefeitos e mesmo imponderáveis, como o ar, o vapor e a eletricidade.</w:t>
       </w:r>
     </w:p>
     <w:p>
@@ -4773,6 +5041,15 @@
         </w:rPr>
         <w:t>A mesa não passa de um instrumento de que o Espírito se utiliza, como se utiliza do lápis para escrever. Para esse efeito, dá-lhe ele uma vitalidade momentânea, por meio do fluido que lhe inocula, porém absolutamente não se identifica com ela.</w:t>
       </w:r>
+      <w:r>
+        <w:rPr>
+          <w:rFonts w:ascii="Garamond" w:hAnsi="Garamond"/>
+          <w:color w:val="00A0FC"/>
+          <w:sz w:val="36"/>
+          <w:szCs w:val="36"/>
+        </w:rPr>
+        <w:t xml:space="preserve"> Ou seja: o Espírito não se torna a mesa, apenas a utiliza.</w:t>
+      </w:r>
     </w:p>
     <w:p>
       <w:pPr>
@@ -4858,196 +5135,137 @@
         </w:rPr>
         <w:t xml:space="preserve">uando a mesa se destaca do solo e flutua no espaço sem ponto de apoio, o Espírito não a ergue com a força de um braço; envolve-a e penetra-a de uma espécie de atmosfera fluídica que neutraliza o efeito da gravitação, como faz o ar com os balões e papagaios. </w:t>
       </w:r>
-    </w:p>
-    <w:p>
-      <w:pPr>
-        <w:pStyle w:val="Normal"/>
-        <w:bidi w:val="0"/>
-        <w:ind w:left="709" w:hanging="0"/>
-        <w:jc w:val="both"/>
-        <w:rPr>
-          <w:rFonts w:ascii="Garamond" w:hAnsi="Garamond"/>
-          <w:color w:val="00A0FC"/>
-          <w:sz w:val="36"/>
-          <w:szCs w:val="36"/>
-        </w:rPr>
-      </w:pPr>
-      <w:r>
-        <w:rPr>
-          <w:rFonts w:ascii="Garamond" w:hAnsi="Garamond"/>
-          <w:color w:val="00A0FC"/>
-          <w:sz w:val="36"/>
-          <w:szCs w:val="36"/>
-        </w:rPr>
-      </w:r>
-    </w:p>
-    <w:p>
-      <w:pPr>
-        <w:pStyle w:val="Normal"/>
-        <w:bidi w:val="0"/>
-        <w:ind w:left="709" w:hanging="0"/>
-        <w:jc w:val="both"/>
-        <w:rPr>
-          <w:rFonts w:ascii="Garamond" w:hAnsi="Garamond"/>
-          <w:color w:val="00A0FC"/>
-          <w:sz w:val="36"/>
-          <w:szCs w:val="36"/>
-          <w:highlight w:val="none"/>
-          <w:shd w:fill="FDE9A9" w:val="clear"/>
-        </w:rPr>
-      </w:pPr>
-      <w:r>
-        <w:rPr>
-          <w:rFonts w:ascii="Garamond" w:hAnsi="Garamond"/>
-          <w:color w:val="00A0FC"/>
-          <w:sz w:val="36"/>
-          <w:szCs w:val="36"/>
-          <w:shd w:fill="FDE9A9" w:val="clear"/>
-        </w:rPr>
-        <w:t>O fluido que se infiltra na mesa dá-lhe momentaneamente maior leveza específica. Quando fica pregada ao solo, ela se acha numa situação análoga à da campânula pneumática sob a qual se fez o vácuo.</w:t>
-      </w:r>
-    </w:p>
-    <w:p>
-      <w:pPr>
-        <w:pStyle w:val="Normal"/>
-        <w:bidi w:val="0"/>
-        <w:ind w:left="709" w:hanging="0"/>
-        <w:jc w:val="both"/>
-        <w:rPr>
-          <w:rFonts w:ascii="Garamond" w:hAnsi="Garamond"/>
-          <w:color w:val="00A0FC"/>
-          <w:sz w:val="36"/>
-          <w:szCs w:val="36"/>
-          <w:highlight w:val="none"/>
-          <w:shd w:fill="FDE9A9" w:val="clear"/>
-        </w:rPr>
-      </w:pPr>
-      <w:r>
-        <w:rPr>
-          <w:rFonts w:ascii="Garamond" w:hAnsi="Garamond"/>
-          <w:color w:val="00A0FC"/>
-          <w:sz w:val="36"/>
-          <w:szCs w:val="36"/>
-          <w:shd w:fill="FDE9A9" w:val="clear"/>
-        </w:rPr>
-      </w:r>
-    </w:p>
-    <w:p>
-      <w:pPr>
-        <w:pStyle w:val="Normal"/>
-        <w:bidi w:val="0"/>
-        <w:ind w:left="709" w:hanging="0"/>
-        <w:jc w:val="both"/>
-        <w:rPr>
-          <w:rFonts w:ascii="Garamond" w:hAnsi="Garamond"/>
-          <w:color w:val="00A0FC"/>
-          <w:sz w:val="36"/>
-          <w:szCs w:val="36"/>
-          <w:highlight w:val="none"/>
-          <w:shd w:fill="FDE9A9" w:val="clear"/>
-        </w:rPr>
-      </w:pPr>
-      <w:r>
-        <w:rPr>
-          <w:rFonts w:ascii="Garamond" w:hAnsi="Garamond"/>
-          <w:color w:val="00A0FC"/>
-          <w:sz w:val="36"/>
-          <w:szCs w:val="36"/>
-          <w:shd w:fill="FDE9A9" w:val="clear"/>
-        </w:rPr>
-        <w:t>A campânula pneumática funciona como um copo colocado de cabeça para baixo sobre uma superfície, mas com o ar de dentro retirado por uma bomba. Quando o ar sai, fica quase vazio por dentro, enquanto do lado de fora continua existindo o peso do ar da atmosfera pressionando o recipiente contra a base. Essa pressão externa é tão forte que parece que a campânula está grudada, mesmo sem cola nenhuma — na verdade, é apenas o ar de fora empurrando com mais força do que há ar dentro para empurrar de volta. Foi essa ideia de uma força invisível pressionando que Kardec usou como comparação no seu exemplo.</w:t>
-      </w:r>
-    </w:p>
-    <w:p>
-      <w:pPr>
-        <w:pStyle w:val="Normal"/>
-        <w:bidi w:val="0"/>
-        <w:ind w:left="709" w:hanging="0"/>
-        <w:jc w:val="both"/>
-        <w:rPr>
-          <w:rFonts w:ascii="Garamond" w:hAnsi="Garamond"/>
-          <w:color w:val="00A0FC"/>
-          <w:sz w:val="36"/>
-          <w:szCs w:val="36"/>
-        </w:rPr>
-      </w:pPr>
-      <w:r>
-        <w:rPr>
-          <w:rFonts w:ascii="Garamond" w:hAnsi="Garamond"/>
-          <w:color w:val="00A0FC"/>
-          <w:sz w:val="36"/>
-          <w:szCs w:val="36"/>
-        </w:rPr>
-      </w:r>
-    </w:p>
-    <w:p>
-      <w:pPr>
-        <w:pStyle w:val="Normal"/>
-        <w:bidi w:val="0"/>
-        <w:ind w:left="709" w:hanging="0"/>
-        <w:jc w:val="both"/>
-        <w:rPr>
-          <w:rFonts w:ascii="Garamond" w:hAnsi="Garamond"/>
-          <w:color w:val="00A0FC"/>
-          <w:sz w:val="36"/>
-          <w:szCs w:val="36"/>
-        </w:rPr>
-      </w:pPr>
-      <w:r>
-        <w:rPr>
-          <w:rFonts w:ascii="Garamond" w:hAnsi="Garamond"/>
-          <w:color w:val="00A0FC"/>
-          <w:sz w:val="36"/>
-          <w:szCs w:val="36"/>
-        </w:rPr>
-        <w:t>Agora nós vamos recorrer a O Livro dos Médiuns, Capítulo V – Das manifestações físicas espontâneas, mais especificamente no item intitulado Fenômeno de transporte.</w:t>
-      </w:r>
-    </w:p>
-    <w:p>
-      <w:pPr>
-        <w:pStyle w:val="Normal"/>
-        <w:bidi w:val="0"/>
-        <w:ind w:left="709" w:hanging="0"/>
-        <w:jc w:val="both"/>
-        <w:rPr>
-          <w:rFonts w:ascii="Garamond" w:hAnsi="Garamond"/>
-          <w:color w:val="00A0FC"/>
-          <w:sz w:val="36"/>
-          <w:szCs w:val="36"/>
-        </w:rPr>
-      </w:pPr>
-      <w:r>
-        <w:rPr>
-          <w:rFonts w:ascii="Garamond" w:hAnsi="Garamond"/>
-          <w:color w:val="00A0FC"/>
-          <w:sz w:val="36"/>
-          <w:szCs w:val="36"/>
-        </w:rPr>
-      </w:r>
-    </w:p>
-    <w:p>
-      <w:pPr>
-        <w:pStyle w:val="Normal"/>
-        <w:bidi w:val="0"/>
-        <w:ind w:left="709" w:hanging="0"/>
-        <w:jc w:val="both"/>
-        <w:rPr>
-          <w:rFonts w:ascii="Garamond" w:hAnsi="Garamond"/>
-          <w:color w:val="00A0FC"/>
-          <w:sz w:val="36"/>
-          <w:szCs w:val="36"/>
-        </w:rPr>
-      </w:pPr>
-      <w:r>
-        <w:rPr>
-          <w:rFonts w:eastAsia="Noto Serif CJK SC" w:cs="Noto Sans Devanagari" w:ascii="Garamond" w:hAnsi="Garamond"/>
-          <w:color w:val="00A0FC"/>
-          <w:kern w:val="2"/>
-          <w:sz w:val="36"/>
-          <w:szCs w:val="36"/>
-          <w:lang w:val="pt-BR" w:eastAsia="zh-CN" w:bidi="hi-IN"/>
-        </w:rPr>
-        <w:t>Mas o que é</w:t>
+      <w:r>
+        <w:rPr>
+          <w:rFonts w:ascii="Garamond" w:hAnsi="Garamond"/>
+          <w:color w:val="00A0FC"/>
+          <w:sz w:val="36"/>
+          <w:szCs w:val="36"/>
+        </w:rPr>
+        <w:t>Em outras palavras: o Espírito anula a ação da gravidade sobre a mesa.</w:t>
+      </w:r>
+    </w:p>
+    <w:p>
+      <w:pPr>
+        <w:pStyle w:val="Normal"/>
+        <w:bidi w:val="0"/>
+        <w:ind w:left="709" w:hanging="0"/>
+        <w:jc w:val="both"/>
+        <w:rPr>
+          <w:rFonts w:ascii="Garamond" w:hAnsi="Garamond"/>
+          <w:color w:val="00A0FC"/>
+          <w:sz w:val="36"/>
+          <w:szCs w:val="36"/>
+        </w:rPr>
+      </w:pPr>
+      <w:r>
+        <w:rPr>
+          <w:rFonts w:ascii="Garamond" w:hAnsi="Garamond"/>
+          <w:color w:val="00A0FC"/>
+          <w:sz w:val="36"/>
+          <w:szCs w:val="36"/>
+        </w:rPr>
+      </w:r>
+    </w:p>
+    <w:p>
+      <w:pPr>
+        <w:pStyle w:val="Normal"/>
+        <w:bidi w:val="0"/>
+        <w:ind w:left="709" w:hanging="0"/>
+        <w:jc w:val="both"/>
+        <w:rPr>
+          <w:rFonts w:ascii="Garamond" w:hAnsi="Garamond"/>
+          <w:color w:val="00A0FC"/>
+          <w:sz w:val="36"/>
+          <w:szCs w:val="36"/>
+        </w:rPr>
+      </w:pPr>
+      <w:r>
+        <w:rPr>
+          <w:rFonts w:ascii="Garamond" w:hAnsi="Garamond"/>
+          <w:color w:val="00A0FC"/>
+          <w:sz w:val="36"/>
+          <w:szCs w:val="36"/>
+        </w:rPr>
+        <w:t xml:space="preserve">Agora nós vamos </w:t>
+      </w:r>
+      <w:r>
+        <w:rPr>
+          <w:rFonts w:eastAsia="Noto Serif CJK SC" w:cs="Noto Sans Devanagari" w:ascii="Garamond" w:hAnsi="Garamond"/>
+          <w:color w:val="00A0FC"/>
+          <w:kern w:val="2"/>
+          <w:sz w:val="36"/>
+          <w:szCs w:val="36"/>
+          <w:lang w:val="pt-BR" w:eastAsia="zh-CN" w:bidi="hi-IN"/>
+        </w:rPr>
+        <w:t>lá para</w:t>
+      </w:r>
+      <w:r>
+        <w:rPr>
+          <w:rFonts w:ascii="Garamond" w:hAnsi="Garamond"/>
+          <w:color w:val="00A0FC"/>
+          <w:sz w:val="36"/>
+          <w:szCs w:val="36"/>
+        </w:rPr>
+        <w:t xml:space="preserve"> O Livro dos Médiuns, Capítulo V – Das manifestações físicas espontâneas, mais especificamente no item intitulado Fenômeno de transporte.</w:t>
+      </w:r>
+    </w:p>
+    <w:p>
+      <w:pPr>
+        <w:pStyle w:val="Normal"/>
+        <w:bidi w:val="0"/>
+        <w:ind w:left="709" w:hanging="0"/>
+        <w:jc w:val="both"/>
+        <w:rPr>
+          <w:rFonts w:ascii="Garamond" w:hAnsi="Garamond"/>
+          <w:color w:val="00A0FC"/>
+          <w:sz w:val="36"/>
+          <w:szCs w:val="36"/>
+        </w:rPr>
+      </w:pPr>
+      <w:r>
+        <w:rPr>
+          <w:rFonts w:ascii="Garamond" w:hAnsi="Garamond"/>
+          <w:color w:val="00A0FC"/>
+          <w:sz w:val="36"/>
+          <w:szCs w:val="36"/>
+        </w:rPr>
+      </w:r>
+    </w:p>
+    <w:p>
+      <w:pPr>
+        <w:pStyle w:val="Normal"/>
+        <w:bidi w:val="0"/>
+        <w:ind w:left="709" w:hanging="0"/>
+        <w:jc w:val="both"/>
+        <w:rPr>
+          <w:rFonts w:ascii="Garamond" w:hAnsi="Garamond"/>
+          <w:color w:val="00A0FC"/>
+          <w:sz w:val="36"/>
+          <w:szCs w:val="36"/>
+        </w:rPr>
+      </w:pPr>
+      <w:r>
+        <w:rPr>
+          <w:rFonts w:eastAsia="Noto Serif CJK SC" w:cs="Noto Sans Devanagari" w:ascii="Garamond" w:hAnsi="Garamond"/>
+          <w:color w:val="00A0FC"/>
+          <w:kern w:val="2"/>
+          <w:sz w:val="36"/>
+          <w:szCs w:val="36"/>
+          <w:lang w:val="pt-BR" w:eastAsia="zh-CN" w:bidi="hi-IN"/>
+        </w:rPr>
+        <w:t xml:space="preserve">Bom, </w:t>
+      </w:r>
+      <w:r>
+        <w:rPr>
+          <w:rFonts w:eastAsia="Noto Serif CJK SC" w:cs="Noto Sans Devanagari" w:ascii="Garamond" w:hAnsi="Garamond"/>
+          <w:color w:val="00A0FC"/>
+          <w:kern w:val="2"/>
+          <w:sz w:val="36"/>
+          <w:szCs w:val="36"/>
+          <w:lang w:val="pt-BR" w:eastAsia="zh-CN" w:bidi="hi-IN"/>
+        </w:rPr>
+        <w:t>o que é</w:t>
       </w:r>
       <w:r>
         <w:rPr>
@@ -5103,229 +5321,215 @@
           <w:szCs w:val="36"/>
           <w:lang w:val="pt-BR" w:eastAsia="zh-CN" w:bidi="hi-IN"/>
         </w:rPr>
-        <w:t>Ocorre</w:t>
-      </w:r>
-      <w:r>
-        <w:rPr>
-          <w:rFonts w:ascii="Garamond" w:hAnsi="Garamond"/>
-          <w:color w:val="00A0FC"/>
-          <w:sz w:val="36"/>
-          <w:szCs w:val="36"/>
-        </w:rPr>
-        <w:t xml:space="preserve"> pela ação dos Espíritos sobre os fluidos e o perispírito, permitindo desagregar temporariamente a matéria do objeto, transportá-lo e depois recompor sua forma original no local de destino. É um fenômeno raro que só acontece em condições muito especiais.</w:t>
-      </w:r>
-    </w:p>
-    <w:p>
-      <w:pPr>
-        <w:pStyle w:val="Normal"/>
-        <w:bidi w:val="0"/>
-        <w:ind w:left="709" w:hanging="0"/>
-        <w:jc w:val="both"/>
-        <w:rPr>
-          <w:rFonts w:ascii="Garamond" w:hAnsi="Garamond"/>
-          <w:color w:val="00A0FC"/>
-          <w:sz w:val="36"/>
-          <w:szCs w:val="36"/>
-        </w:rPr>
-      </w:pPr>
-      <w:r>
-        <w:rPr>
-          <w:rFonts w:ascii="Garamond" w:hAnsi="Garamond"/>
-          <w:color w:val="00A0FC"/>
-          <w:sz w:val="36"/>
-          <w:szCs w:val="36"/>
-        </w:rPr>
-      </w:r>
-    </w:p>
-    <w:p>
-      <w:pPr>
-        <w:pStyle w:val="Normal"/>
-        <w:bidi w:val="0"/>
-        <w:ind w:left="709" w:hanging="0"/>
-        <w:jc w:val="both"/>
-        <w:rPr>
-          <w:rFonts w:ascii="Garamond" w:hAnsi="Garamond"/>
-          <w:color w:val="00A0FC"/>
-          <w:sz w:val="36"/>
-          <w:szCs w:val="36"/>
-        </w:rPr>
-      </w:pPr>
-      <w:r>
-        <w:rPr>
-          <w:rFonts w:eastAsia="Noto Serif CJK SC" w:cs="Noto Sans Devanagari" w:ascii="Garamond" w:hAnsi="Garamond"/>
-          <w:color w:val="00A0FC"/>
-          <w:kern w:val="2"/>
-          <w:sz w:val="36"/>
-          <w:szCs w:val="36"/>
-          <w:lang w:val="pt-BR" w:eastAsia="zh-CN" w:bidi="hi-IN"/>
-        </w:rPr>
-        <w:t>Vamos analisar apenas a parte que está vinculada à resposta da Espiritualidade para a pergunta 526.</w:t>
-      </w:r>
-    </w:p>
-    <w:p>
-      <w:pPr>
-        <w:pStyle w:val="Normal"/>
-        <w:bidi w:val="0"/>
-        <w:ind w:left="709" w:hanging="0"/>
-        <w:jc w:val="both"/>
-        <w:rPr>
-          <w:rFonts w:ascii="Garamond" w:hAnsi="Garamond"/>
-          <w:color w:val="00A0FC"/>
-          <w:sz w:val="36"/>
-          <w:szCs w:val="36"/>
-        </w:rPr>
-      </w:pPr>
-      <w:r>
-        <w:rPr>
-          <w:rFonts w:ascii="Garamond" w:hAnsi="Garamond"/>
-          <w:color w:val="00A0FC"/>
-          <w:sz w:val="36"/>
-          <w:szCs w:val="36"/>
-        </w:rPr>
-      </w:r>
-    </w:p>
-    <w:p>
-      <w:pPr>
-        <w:pStyle w:val="Normal"/>
-        <w:bidi w:val="0"/>
-        <w:ind w:left="709" w:hanging="0"/>
-        <w:jc w:val="both"/>
-        <w:rPr>
-          <w:rFonts w:ascii="Garamond" w:hAnsi="Garamond"/>
-          <w:color w:val="00A0FC"/>
-          <w:sz w:val="36"/>
-          <w:szCs w:val="36"/>
-        </w:rPr>
-      </w:pPr>
-      <w:r>
-        <w:rPr>
-          <w:rFonts w:eastAsia="Noto Serif CJK SC" w:cs="Noto Sans Devanagari" w:ascii="Garamond" w:hAnsi="Garamond"/>
-          <w:color w:val="00A0FC"/>
-          <w:kern w:val="2"/>
-          <w:sz w:val="36"/>
-          <w:szCs w:val="36"/>
-          <w:lang w:val="pt-BR" w:eastAsia="zh-CN" w:bidi="hi-IN"/>
-        </w:rPr>
-        <w:t>----- Texto precisa de adaptação</w:t>
-      </w:r>
-    </w:p>
-    <w:p>
-      <w:pPr>
-        <w:pStyle w:val="Normal"/>
-        <w:bidi w:val="0"/>
-        <w:ind w:left="709" w:hanging="0"/>
-        <w:jc w:val="both"/>
-        <w:rPr>
-          <w:rFonts w:ascii="Garamond" w:hAnsi="Garamond"/>
-          <w:color w:val="00A0FC"/>
-          <w:sz w:val="36"/>
-          <w:szCs w:val="36"/>
-        </w:rPr>
-      </w:pPr>
-      <w:r>
-        <w:rPr>
-          <w:rFonts w:eastAsia="Noto Serif CJK SC" w:cs="Noto Sans Devanagari" w:ascii="Garamond" w:hAnsi="Garamond"/>
-          <w:color w:val="00A0FC"/>
-          <w:kern w:val="2"/>
-          <w:sz w:val="36"/>
-          <w:szCs w:val="36"/>
-          <w:lang w:val="pt-BR" w:eastAsia="zh-CN" w:bidi="hi-IN"/>
-        </w:rPr>
-        <w:t>Pergunta nº 14</w:t>
-      </w:r>
-    </w:p>
-    <w:p>
-      <w:pPr>
-        <w:pStyle w:val="Normal"/>
-        <w:bidi w:val="0"/>
-        <w:ind w:left="709" w:hanging="0"/>
-        <w:jc w:val="both"/>
-        <w:rPr>
-          <w:rFonts w:ascii="Garamond" w:hAnsi="Garamond"/>
-          <w:color w:val="00A0FC"/>
-          <w:sz w:val="36"/>
-          <w:szCs w:val="36"/>
-        </w:rPr>
-      </w:pPr>
-      <w:r>
-        <w:rPr>
-          <w:rFonts w:ascii="Garamond" w:hAnsi="Garamond"/>
-          <w:color w:val="00A0FC"/>
-          <w:sz w:val="36"/>
-          <w:szCs w:val="36"/>
-        </w:rPr>
-      </w:r>
-    </w:p>
-    <w:p>
-      <w:pPr>
-        <w:pStyle w:val="Normal"/>
-        <w:bidi w:val="0"/>
-        <w:ind w:left="709" w:hanging="0"/>
-        <w:jc w:val="both"/>
-        <w:rPr>
-          <w:rFonts w:ascii="Garamond" w:hAnsi="Garamond"/>
-          <w:color w:val="00A0FC"/>
-          <w:sz w:val="36"/>
-          <w:szCs w:val="36"/>
-        </w:rPr>
-      </w:pPr>
-      <w:r>
-        <w:rPr>
-          <w:rFonts w:eastAsia="Noto Serif CJK SC" w:cs="Noto Sans Devanagari" w:ascii="Garamond" w:hAnsi="Garamond"/>
-          <w:color w:val="00A0FC"/>
-          <w:kern w:val="2"/>
-          <w:sz w:val="36"/>
-          <w:szCs w:val="36"/>
-          <w:lang w:val="pt-BR" w:eastAsia="zh-CN" w:bidi="hi-IN"/>
-        </w:rPr>
-        <w:t>A nota de Erasto à resposta dada pelo espírito operante vem atestar o que dissemos acima no comentário da pergunta nº 8. Erasto nos esclarece que o espírito pode anular o efeito da gravidade transportando tanto um objeto que pese 2 kilos quanto um  que pese 200 kgs. Contudo, o espírito não prescinde da combinação fluída necessária para o transporte e a quantidade de fluido necessária está na proporção do peso do objeto a ser transportado.</w:t>
-      </w:r>
-    </w:p>
-    <w:p>
-      <w:pPr>
-        <w:pStyle w:val="Normal"/>
-        <w:bidi w:val="0"/>
-        <w:ind w:left="709" w:hanging="0"/>
-        <w:jc w:val="both"/>
-        <w:rPr>
-          <w:rFonts w:ascii="Garamond" w:hAnsi="Garamond"/>
-          <w:color w:val="00A0FC"/>
-          <w:sz w:val="36"/>
-          <w:szCs w:val="36"/>
-        </w:rPr>
-      </w:pPr>
-      <w:r>
-        <w:rPr>
-          <w:rFonts w:ascii="Garamond" w:hAnsi="Garamond"/>
-          <w:color w:val="00A0FC"/>
-          <w:sz w:val="36"/>
-          <w:szCs w:val="36"/>
-        </w:rPr>
-      </w:r>
-    </w:p>
-    <w:p>
-      <w:pPr>
-        <w:pStyle w:val="Normal"/>
-        <w:bidi w:val="0"/>
-        <w:ind w:left="709" w:hanging="0"/>
-        <w:jc w:val="both"/>
-        <w:rPr>
-          <w:rFonts w:ascii="Garamond" w:hAnsi="Garamond"/>
-          <w:color w:val="00A0FC"/>
-          <w:sz w:val="36"/>
-          <w:szCs w:val="36"/>
-        </w:rPr>
-      </w:pPr>
-      <w:r>
-        <w:rPr>
-          <w:rFonts w:eastAsia="Noto Serif CJK SC" w:cs="Noto Sans Devanagari" w:ascii="Garamond" w:hAnsi="Garamond"/>
-          <w:color w:val="00A0FC"/>
-          <w:kern w:val="2"/>
-          <w:sz w:val="36"/>
-          <w:szCs w:val="36"/>
-          <w:lang w:val="pt-BR" w:eastAsia="zh-CN" w:bidi="hi-IN"/>
-        </w:rPr>
-        <w:t>Não se trata de uma violação da lei da gravidade que, sendo uma lei da Física é também uma lei de Deus; o que se dá no caso é a supensão temporária dos efeitos dessa lei sobre o objeto a ser transportado. Isso prova o quanto ainda desconhecemos sobre as leis naturais que regem o nosso mundo.</w:t>
+        <w:t>E</w:t>
+      </w:r>
+      <w:r>
+        <w:rPr>
+          <w:rFonts w:ascii="Garamond" w:hAnsi="Garamond"/>
+          <w:color w:val="00A0FC"/>
+          <w:sz w:val="36"/>
+          <w:szCs w:val="36"/>
+        </w:rPr>
+        <w:t>sse fenômeno é sempre realizado por um Espírito que utiliza seus fluidos combinados com o fluido do médium que lhe serve de instrumento.  É um fenômeno extremamente raro porque exige condições muitos especiais para ser realizado.</w:t>
+      </w:r>
+    </w:p>
+    <w:p>
+      <w:pPr>
+        <w:pStyle w:val="Normal"/>
+        <w:bidi w:val="0"/>
+        <w:ind w:left="709" w:hanging="0"/>
+        <w:jc w:val="both"/>
+        <w:rPr>
+          <w:rFonts w:ascii="Garamond" w:hAnsi="Garamond"/>
+          <w:color w:val="00A0FC"/>
+          <w:sz w:val="36"/>
+          <w:szCs w:val="36"/>
+        </w:rPr>
+      </w:pPr>
+      <w:r>
+        <w:rPr>
+          <w:rFonts w:ascii="Garamond" w:hAnsi="Garamond"/>
+          <w:color w:val="00A0FC"/>
+          <w:sz w:val="36"/>
+          <w:szCs w:val="36"/>
+        </w:rPr>
+      </w:r>
+    </w:p>
+    <w:p>
+      <w:pPr>
+        <w:pStyle w:val="Normal"/>
+        <w:bidi w:val="0"/>
+        <w:ind w:left="709" w:hanging="0"/>
+        <w:jc w:val="both"/>
+        <w:rPr>
+          <w:rFonts w:ascii="Garamond" w:hAnsi="Garamond"/>
+          <w:color w:val="00A0FC"/>
+          <w:sz w:val="36"/>
+          <w:szCs w:val="36"/>
+        </w:rPr>
+      </w:pPr>
+      <w:r>
+        <w:rPr>
+          <w:rFonts w:ascii="Garamond" w:hAnsi="Garamond"/>
+          <w:color w:val="00A0FC"/>
+          <w:sz w:val="36"/>
+          <w:szCs w:val="36"/>
+        </w:rPr>
+        <w:t xml:space="preserve">O fenômeno </w:t>
+      </w:r>
+      <w:r>
+        <w:rPr>
+          <w:rFonts w:eastAsia="Noto Serif CJK SC" w:cs="Noto Sans Devanagari" w:ascii="Garamond" w:hAnsi="Garamond"/>
+          <w:color w:val="00A0FC"/>
+          <w:kern w:val="2"/>
+          <w:sz w:val="36"/>
+          <w:szCs w:val="36"/>
+          <w:lang w:val="pt-BR" w:eastAsia="zh-CN" w:bidi="hi-IN"/>
+        </w:rPr>
+        <w:t>analisado</w:t>
+      </w:r>
+      <w:r>
+        <w:rPr>
+          <w:rFonts w:ascii="Garamond" w:hAnsi="Garamond"/>
+          <w:color w:val="00A0FC"/>
+          <w:sz w:val="36"/>
+          <w:szCs w:val="36"/>
+        </w:rPr>
+        <w:t xml:space="preserve"> em O Livro dos Médiuns é o de um Espírito que levou flores, confeitos e anéis até um recinto onde se encontravam algumas pessoas.</w:t>
+      </w:r>
+    </w:p>
+    <w:p>
+      <w:pPr>
+        <w:pStyle w:val="Normal"/>
+        <w:bidi w:val="0"/>
+        <w:ind w:left="709" w:hanging="0"/>
+        <w:jc w:val="both"/>
+        <w:rPr>
+          <w:rFonts w:ascii="Garamond" w:hAnsi="Garamond"/>
+          <w:color w:val="00A0FC"/>
+          <w:sz w:val="36"/>
+          <w:szCs w:val="36"/>
+        </w:rPr>
+      </w:pPr>
+      <w:r>
+        <w:rPr>
+          <w:rFonts w:ascii="Garamond" w:hAnsi="Garamond"/>
+          <w:color w:val="00A0FC"/>
+          <w:sz w:val="36"/>
+          <w:szCs w:val="36"/>
+        </w:rPr>
+      </w:r>
+    </w:p>
+    <w:p>
+      <w:pPr>
+        <w:pStyle w:val="Normal"/>
+        <w:bidi w:val="0"/>
+        <w:ind w:left="709" w:hanging="0"/>
+        <w:jc w:val="both"/>
+        <w:rPr>
+          <w:rFonts w:ascii="Garamond" w:hAnsi="Garamond"/>
+          <w:color w:val="00A0FC"/>
+          <w:sz w:val="36"/>
+          <w:szCs w:val="36"/>
+        </w:rPr>
+      </w:pPr>
+      <w:r>
+        <w:rPr>
+          <w:rFonts w:ascii="Garamond" w:hAnsi="Garamond"/>
+          <w:color w:val="00A0FC"/>
+          <w:sz w:val="36"/>
+          <w:szCs w:val="36"/>
+        </w:rPr>
+        <w:t xml:space="preserve">São feitas </w:t>
+      </w:r>
+      <w:r>
+        <w:rPr>
+          <w:rFonts w:eastAsia="Noto Serif CJK SC" w:cs="Noto Sans Devanagari" w:ascii="Garamond" w:hAnsi="Garamond"/>
+          <w:color w:val="00A0FC"/>
+          <w:kern w:val="2"/>
+          <w:sz w:val="36"/>
+          <w:szCs w:val="36"/>
+          <w:lang w:val="pt-BR" w:eastAsia="zh-CN" w:bidi="hi-IN"/>
+        </w:rPr>
+        <w:t>várias</w:t>
+      </w:r>
+      <w:r>
+        <w:rPr>
+          <w:rFonts w:ascii="Garamond" w:hAnsi="Garamond"/>
+          <w:color w:val="00A0FC"/>
+          <w:sz w:val="36"/>
+          <w:szCs w:val="36"/>
+        </w:rPr>
+        <w:t xml:space="preserve"> perguntas ao Espírito que realizou o transporte. Por se tratar de um Espírito não muito evoluído, algumas de suas respostas precisaram ser complementadas por um Espírito chamado Erasto, conhecedor profundo do fenômeno.</w:t>
+      </w:r>
+    </w:p>
+    <w:p>
+      <w:pPr>
+        <w:pStyle w:val="Normal"/>
+        <w:bidi w:val="0"/>
+        <w:ind w:left="709" w:hanging="0"/>
+        <w:jc w:val="both"/>
+        <w:rPr>
+          <w:rFonts w:ascii="Garamond" w:hAnsi="Garamond"/>
+          <w:color w:val="00A0FC"/>
+          <w:sz w:val="36"/>
+          <w:szCs w:val="36"/>
+        </w:rPr>
+      </w:pPr>
+      <w:r>
+        <w:rPr>
+          <w:rFonts w:ascii="Garamond" w:hAnsi="Garamond"/>
+          <w:color w:val="00A0FC"/>
+          <w:sz w:val="36"/>
+          <w:szCs w:val="36"/>
+        </w:rPr>
+      </w:r>
+    </w:p>
+    <w:p>
+      <w:pPr>
+        <w:pStyle w:val="Normal"/>
+        <w:bidi w:val="0"/>
+        <w:ind w:left="709" w:hanging="0"/>
+        <w:jc w:val="both"/>
+        <w:rPr>
+          <w:rFonts w:ascii="Garamond" w:hAnsi="Garamond"/>
+          <w:color w:val="00A0FC"/>
+          <w:sz w:val="36"/>
+          <w:szCs w:val="36"/>
+        </w:rPr>
+      </w:pPr>
+      <w:r>
+        <w:rPr>
+          <w:rFonts w:eastAsia="Noto Serif CJK SC" w:cs="Noto Sans Devanagari" w:ascii="Garamond" w:hAnsi="Garamond"/>
+          <w:color w:val="00A0FC"/>
+          <w:kern w:val="2"/>
+          <w:sz w:val="36"/>
+          <w:szCs w:val="36"/>
+          <w:lang w:val="pt-BR" w:eastAsia="zh-CN" w:bidi="hi-IN"/>
+        </w:rPr>
+        <w:t xml:space="preserve">Vamos analisar apenas a parte que </w:t>
+      </w:r>
+      <w:r>
+        <w:rPr>
+          <w:rFonts w:eastAsia="Noto Serif CJK SC" w:cs="Noto Sans Devanagari" w:ascii="Garamond" w:hAnsi="Garamond"/>
+          <w:color w:val="00A0FC"/>
+          <w:kern w:val="2"/>
+          <w:sz w:val="36"/>
+          <w:szCs w:val="36"/>
+          <w:lang w:val="pt-BR" w:eastAsia="zh-CN" w:bidi="hi-IN"/>
+        </w:rPr>
+        <w:t>nos interessa para compreender a</w:t>
+      </w:r>
+      <w:r>
+        <w:rPr>
+          <w:rFonts w:eastAsia="Noto Serif CJK SC" w:cs="Noto Sans Devanagari" w:ascii="Garamond" w:hAnsi="Garamond"/>
+          <w:color w:val="00A0FC"/>
+          <w:kern w:val="2"/>
+          <w:sz w:val="36"/>
+          <w:szCs w:val="36"/>
+          <w:lang w:val="pt-BR" w:eastAsia="zh-CN" w:bidi="hi-IN"/>
+        </w:rPr>
+        <w:t xml:space="preserve"> resposta da Espiritualidade para a pergunta 526.</w:t>
       </w:r>
     </w:p>
     <w:p>
@@ -5367,7 +5571,7 @@
           <w:szCs w:val="36"/>
           <w:lang w:val="pt-BR" w:eastAsia="zh-CN" w:bidi="hi-IN"/>
         </w:rPr>
-        <w:t>Perguntado sobre como conseguiu colocar determinados objetos em um recinto completamente fechado, o espírito diz não poder dar maiores detalhes de como executou essa ação.</w:t>
+        <w:t>Perguntam ao Espírito operante se faz alguma diferença para ele transportar um objeto que pese alguns gramas ou objeto que pese 50 kilos. Ele responde que o peso não representa nada para eles, Espíritos.</w:t>
       </w:r>
     </w:p>
     <w:p>
@@ -5409,54 +5613,1778 @@
           <w:szCs w:val="36"/>
           <w:lang w:val="pt-BR" w:eastAsia="zh-CN" w:bidi="hi-IN"/>
         </w:rPr>
-        <w:t>É bastante provável que se faltassem recursos ao espírito para explicar sua ação, Erasto teria adicionado uma nota esclarecendo a questão, o que não foi o caso. Parece-nos então que a impossibilidade de uma explicação em detalhes deve-se mais à nossa incapacidade de compreender certos fenômenos e propriedades da matéria do que por desconhecimento do espírito sobre a maneira como agiu.</w:t>
-      </w:r>
-    </w:p>
-    <w:p>
-      <w:pPr>
-        <w:pStyle w:val="Normal"/>
-        <w:bidi w:val="0"/>
-        <w:ind w:left="709" w:hanging="0"/>
-        <w:jc w:val="both"/>
-        <w:rPr>
-          <w:rFonts w:ascii="Garamond" w:hAnsi="Garamond"/>
-          <w:color w:val="00A0FC"/>
-          <w:sz w:val="36"/>
-          <w:szCs w:val="36"/>
-        </w:rPr>
-      </w:pPr>
-      <w:r>
-        <w:rPr>
-          <w:rFonts w:ascii="Garamond" w:hAnsi="Garamond"/>
-          <w:color w:val="00A0FC"/>
-          <w:sz w:val="36"/>
-          <w:szCs w:val="36"/>
-        </w:rPr>
-      </w:r>
-    </w:p>
-    <w:p>
-      <w:pPr>
-        <w:pStyle w:val="Normal"/>
-        <w:bidi w:val="0"/>
-        <w:ind w:left="709" w:hanging="0"/>
-        <w:jc w:val="both"/>
-        <w:rPr>
-          <w:rFonts w:ascii="Garamond" w:hAnsi="Garamond"/>
-          <w:color w:val="00A0FC"/>
-          <w:sz w:val="36"/>
-          <w:szCs w:val="36"/>
-        </w:rPr>
-      </w:pPr>
-      <w:r>
-        <w:rPr>
-          <w:rFonts w:eastAsia="Noto Serif CJK SC" w:cs="Noto Sans Devanagari" w:ascii="Garamond" w:hAnsi="Garamond"/>
-          <w:color w:val="00A0FC"/>
-          <w:kern w:val="2"/>
-          <w:sz w:val="36"/>
-          <w:szCs w:val="36"/>
-          <w:lang w:val="pt-BR" w:eastAsia="zh-CN" w:bidi="hi-IN"/>
-        </w:rPr>
-        <w:t>----- Texto precisa de adaptação</w:t>
+        <w:t xml:space="preserve">Erasto </w:t>
+      </w:r>
+      <w:r>
+        <w:rPr>
+          <w:rFonts w:eastAsia="Noto Serif CJK SC" w:cs="Noto Sans Devanagari" w:ascii="Garamond" w:hAnsi="Garamond"/>
+          <w:color w:val="00A0FC"/>
+          <w:kern w:val="2"/>
+          <w:sz w:val="36"/>
+          <w:szCs w:val="36"/>
+          <w:lang w:val="pt-BR" w:eastAsia="zh-CN" w:bidi="hi-IN"/>
+        </w:rPr>
+        <w:t xml:space="preserve">confirma a resposta e </w:t>
+      </w:r>
+      <w:r>
+        <w:rPr>
+          <w:rFonts w:eastAsia="Noto Serif CJK SC" w:cs="Noto Sans Devanagari" w:ascii="Garamond" w:hAnsi="Garamond"/>
+          <w:color w:val="00A0FC"/>
+          <w:kern w:val="2"/>
+          <w:sz w:val="36"/>
+          <w:szCs w:val="36"/>
+          <w:lang w:val="pt-BR" w:eastAsia="zh-CN" w:bidi="hi-IN"/>
+        </w:rPr>
+        <w:t>esclarece que o espírito pode anular o efeito da gravidade transportando tanto um objeto que pese 2 kilos quanto um  que pese 200 k</w:t>
+      </w:r>
+      <w:r>
+        <w:rPr>
+          <w:rFonts w:eastAsia="Noto Serif CJK SC" w:cs="Noto Sans Devanagari" w:ascii="Garamond" w:hAnsi="Garamond"/>
+          <w:color w:val="00A0FC"/>
+          <w:kern w:val="2"/>
+          <w:sz w:val="36"/>
+          <w:szCs w:val="36"/>
+          <w:lang w:val="pt-BR" w:eastAsia="zh-CN" w:bidi="hi-IN"/>
+        </w:rPr>
+        <w:t>ilos, desde que a combinação fluídica seja apropriada ao transporte de um objeto daquele peso.</w:t>
+      </w:r>
+    </w:p>
+    <w:p>
+      <w:pPr>
+        <w:pStyle w:val="Normal"/>
+        <w:bidi w:val="0"/>
+        <w:ind w:left="709" w:hanging="0"/>
+        <w:jc w:val="both"/>
+        <w:rPr>
+          <w:rFonts w:ascii="Garamond" w:hAnsi="Garamond"/>
+          <w:color w:val="00A0FC"/>
+          <w:sz w:val="36"/>
+          <w:szCs w:val="36"/>
+        </w:rPr>
+      </w:pPr>
+      <w:r>
+        <w:rPr/>
+      </w:r>
+    </w:p>
+    <w:p>
+      <w:pPr>
+        <w:pStyle w:val="Normal"/>
+        <w:bidi w:val="0"/>
+        <w:ind w:left="709" w:hanging="0"/>
+        <w:jc w:val="both"/>
+        <w:rPr>
+          <w:rFonts w:ascii="Garamond" w:hAnsi="Garamond"/>
+          <w:color w:val="00A0FC"/>
+          <w:sz w:val="36"/>
+          <w:szCs w:val="36"/>
+        </w:rPr>
+      </w:pPr>
+      <w:r>
+        <w:rPr>
+          <w:rFonts w:eastAsia="Noto Serif CJK SC" w:cs="Noto Sans Devanagari" w:ascii="Garamond" w:hAnsi="Garamond"/>
+          <w:color w:val="00A0FC"/>
+          <w:kern w:val="2"/>
+          <w:sz w:val="36"/>
+          <w:szCs w:val="36"/>
+          <w:lang w:val="pt-BR" w:eastAsia="zh-CN" w:bidi="hi-IN"/>
+        </w:rPr>
+        <w:t>Erasto diz ainda que n</w:t>
+      </w:r>
+      <w:r>
+        <w:rPr>
+          <w:rFonts w:eastAsia="Noto Serif CJK SC" w:cs="Noto Sans Devanagari" w:ascii="Garamond" w:hAnsi="Garamond"/>
+          <w:color w:val="00A0FC"/>
+          <w:kern w:val="2"/>
+          <w:sz w:val="36"/>
+          <w:szCs w:val="36"/>
+          <w:lang w:val="pt-BR" w:eastAsia="zh-CN" w:bidi="hi-IN"/>
+        </w:rPr>
+        <w:t>ão se trata de uma violação da lei da gravidade que, sendo uma lei da Física é também uma lei de Deus; o que se dá no caso é a supensão temporária dos efeitos dessa lei sobre o objeto a ser transportado. Isso prova o quanto ainda desconhecemos sobre as leis naturais que regem o nosso mundo.</w:t>
+      </w:r>
+    </w:p>
+    <w:p>
+      <w:pPr>
+        <w:pStyle w:val="Normal"/>
+        <w:bidi w:val="0"/>
+        <w:ind w:left="709" w:hanging="0"/>
+        <w:jc w:val="both"/>
+        <w:rPr>
+          <w:rFonts w:ascii="Garamond" w:hAnsi="Garamond"/>
+          <w:color w:val="00A0FC"/>
+          <w:sz w:val="36"/>
+          <w:szCs w:val="36"/>
+        </w:rPr>
+      </w:pPr>
+      <w:r>
+        <w:rPr>
+          <w:rFonts w:ascii="Garamond" w:hAnsi="Garamond"/>
+          <w:color w:val="00A0FC"/>
+          <w:sz w:val="36"/>
+          <w:szCs w:val="36"/>
+        </w:rPr>
+      </w:r>
+    </w:p>
+    <w:p>
+      <w:pPr>
+        <w:pStyle w:val="Normal"/>
+        <w:bidi w:val="0"/>
+        <w:ind w:left="709" w:hanging="0"/>
+        <w:jc w:val="both"/>
+        <w:rPr>
+          <w:rFonts w:ascii="Garamond" w:hAnsi="Garamond"/>
+          <w:color w:val="00A0FC"/>
+          <w:sz w:val="36"/>
+          <w:szCs w:val="36"/>
+        </w:rPr>
+      </w:pPr>
+      <w:r>
+        <w:rPr>
+          <w:rFonts w:eastAsia="Noto Serif CJK SC" w:cs="Noto Sans Devanagari" w:ascii="Garamond" w:hAnsi="Garamond"/>
+          <w:color w:val="00A0FC"/>
+          <w:kern w:val="2"/>
+          <w:sz w:val="36"/>
+          <w:szCs w:val="36"/>
+          <w:lang w:val="pt-BR" w:eastAsia="zh-CN" w:bidi="hi-IN"/>
+        </w:rPr>
+        <w:t xml:space="preserve">Mais adiante perguntam ao Espírito </w:t>
+      </w:r>
+      <w:r>
+        <w:rPr>
+          <w:rFonts w:eastAsia="Noto Serif CJK SC" w:cs="Noto Sans Devanagari" w:ascii="Garamond" w:hAnsi="Garamond"/>
+          <w:color w:val="00A0FC"/>
+          <w:kern w:val="2"/>
+          <w:sz w:val="36"/>
+          <w:szCs w:val="36"/>
+          <w:lang w:val="pt-BR" w:eastAsia="zh-CN" w:bidi="hi-IN"/>
+        </w:rPr>
+        <w:t xml:space="preserve">como </w:t>
+      </w:r>
+      <w:r>
+        <w:rPr>
+          <w:rFonts w:eastAsia="Noto Serif CJK SC" w:cs="Noto Sans Devanagari" w:ascii="Garamond" w:hAnsi="Garamond"/>
+          <w:color w:val="00A0FC"/>
+          <w:kern w:val="2"/>
+          <w:sz w:val="36"/>
+          <w:szCs w:val="36"/>
+          <w:lang w:val="pt-BR" w:eastAsia="zh-CN" w:bidi="hi-IN"/>
+        </w:rPr>
+        <w:t xml:space="preserve">ele </w:t>
+      </w:r>
+      <w:r>
+        <w:rPr>
+          <w:rFonts w:eastAsia="Noto Serif CJK SC" w:cs="Noto Sans Devanagari" w:ascii="Garamond" w:hAnsi="Garamond"/>
+          <w:color w:val="00A0FC"/>
+          <w:kern w:val="2"/>
+          <w:sz w:val="36"/>
+          <w:szCs w:val="36"/>
+          <w:lang w:val="pt-BR" w:eastAsia="zh-CN" w:bidi="hi-IN"/>
+        </w:rPr>
+        <w:t>conseguiu colocar determinados objetos em um recinto completamente fechado</w:t>
+      </w:r>
+      <w:r>
+        <w:rPr>
+          <w:rFonts w:eastAsia="Noto Serif CJK SC" w:cs="Noto Sans Devanagari" w:ascii="Garamond" w:hAnsi="Garamond"/>
+          <w:color w:val="00A0FC"/>
+          <w:kern w:val="2"/>
+          <w:sz w:val="36"/>
+          <w:szCs w:val="36"/>
+          <w:lang w:val="pt-BR" w:eastAsia="zh-CN" w:bidi="hi-IN"/>
+        </w:rPr>
+        <w:t>. Ou seja: o local estava fechado, mas ainda assim o Espírito conseguiu colocar ali alguns objetos.</w:t>
+      </w:r>
+    </w:p>
+    <w:p>
+      <w:pPr>
+        <w:pStyle w:val="Normal"/>
+        <w:bidi w:val="0"/>
+        <w:ind w:left="709" w:hanging="0"/>
+        <w:jc w:val="both"/>
+        <w:rPr>
+          <w:rFonts w:ascii="Garamond" w:hAnsi="Garamond"/>
+          <w:color w:val="00A0FC"/>
+          <w:sz w:val="36"/>
+          <w:szCs w:val="36"/>
+        </w:rPr>
+      </w:pPr>
+      <w:r>
+        <w:rPr/>
+      </w:r>
+    </w:p>
+    <w:p>
+      <w:pPr>
+        <w:pStyle w:val="Normal"/>
+        <w:bidi w:val="0"/>
+        <w:ind w:left="709" w:hanging="0"/>
+        <w:jc w:val="both"/>
+        <w:rPr>
+          <w:rFonts w:ascii="Garamond" w:hAnsi="Garamond"/>
+          <w:color w:val="00A0FC"/>
+          <w:sz w:val="36"/>
+          <w:szCs w:val="36"/>
+        </w:rPr>
+      </w:pPr>
+      <w:r>
+        <w:rPr>
+          <w:rFonts w:eastAsia="Noto Serif CJK SC" w:cs="Noto Sans Devanagari" w:ascii="Garamond" w:hAnsi="Garamond"/>
+          <w:color w:val="00A0FC"/>
+          <w:kern w:val="2"/>
+          <w:sz w:val="36"/>
+          <w:szCs w:val="36"/>
+          <w:lang w:val="pt-BR" w:eastAsia="zh-CN" w:bidi="hi-IN"/>
+        </w:rPr>
+        <w:t>Então ele responde:</w:t>
+      </w:r>
+    </w:p>
+    <w:p>
+      <w:pPr>
+        <w:pStyle w:val="Normal"/>
+        <w:bidi w:val="0"/>
+        <w:ind w:left="709" w:hanging="0"/>
+        <w:jc w:val="both"/>
+        <w:rPr>
+          <w:rFonts w:ascii="Garamond" w:hAnsi="Garamond"/>
+          <w:color w:val="00A0FC"/>
+          <w:sz w:val="36"/>
+          <w:szCs w:val="36"/>
+        </w:rPr>
+      </w:pPr>
+      <w:r>
+        <w:rPr/>
+      </w:r>
+    </w:p>
+    <w:p>
+      <w:pPr>
+        <w:pStyle w:val="Normal"/>
+        <w:bidi w:val="0"/>
+        <w:ind w:left="709" w:hanging="0"/>
+        <w:jc w:val="both"/>
+        <w:rPr>
+          <w:rFonts w:ascii="Garamond" w:hAnsi="Garamond"/>
+          <w:color w:val="00A0FC"/>
+          <w:sz w:val="36"/>
+          <w:szCs w:val="36"/>
+        </w:rPr>
+      </w:pPr>
+      <w:r>
+        <w:rPr/>
+      </w:r>
+    </w:p>
+    <w:p>
+      <w:pPr>
+        <w:pStyle w:val="Normal"/>
+        <w:bidi w:val="0"/>
+        <w:ind w:left="1418" w:hanging="0"/>
+        <w:jc w:val="both"/>
+        <w:rPr>
+          <w:i/>
+          <w:i/>
+          <w:iCs/>
+        </w:rPr>
+      </w:pPr>
+      <w:r>
+        <w:rPr>
+          <w:rFonts w:eastAsia="Noto Serif CJK SC" w:cs="Noto Sans Devanagari" w:ascii="Garamond" w:hAnsi="Garamond"/>
+          <w:i/>
+          <w:iCs/>
+          <w:color w:val="00A0FC"/>
+          <w:kern w:val="2"/>
+          <w:sz w:val="36"/>
+          <w:szCs w:val="36"/>
+          <w:lang w:val="pt-BR" w:eastAsia="zh-CN" w:bidi="hi-IN"/>
+        </w:rPr>
+        <w:t>Fi-los entrar comigo, envoltos, por assim dizer, na minha substância. Nada mais posso dizer, por não ser explicável o fato.</w:t>
+      </w:r>
+    </w:p>
+    <w:p>
+      <w:pPr>
+        <w:pStyle w:val="Normal"/>
+        <w:bidi w:val="0"/>
+        <w:ind w:left="709" w:hanging="0"/>
+        <w:jc w:val="both"/>
+        <w:rPr>
+          <w:rFonts w:ascii="Garamond" w:hAnsi="Garamond"/>
+          <w:color w:val="00A0FC"/>
+          <w:sz w:val="36"/>
+          <w:szCs w:val="36"/>
+        </w:rPr>
+      </w:pPr>
+      <w:r>
+        <w:rPr/>
+      </w:r>
+    </w:p>
+    <w:p>
+      <w:pPr>
+        <w:pStyle w:val="Normal"/>
+        <w:bidi w:val="0"/>
+        <w:ind w:left="709" w:hanging="0"/>
+        <w:jc w:val="both"/>
+        <w:rPr/>
+      </w:pPr>
+      <w:r>
+        <w:rPr>
+          <w:rFonts w:eastAsia="Noto Serif CJK SC" w:cs="Noto Sans Devanagari" w:ascii="Garamond" w:hAnsi="Garamond"/>
+          <w:color w:val="00A0FC"/>
+          <w:kern w:val="2"/>
+          <w:sz w:val="36"/>
+          <w:szCs w:val="36"/>
+          <w:lang w:val="pt-BR" w:eastAsia="zh-CN" w:bidi="hi-IN"/>
+        </w:rPr>
+        <w:t>E aqui temos que prestar atenção ao seguinte:  é</w:t>
+      </w:r>
+      <w:r>
+        <w:rPr>
+          <w:rFonts w:eastAsia="Noto Serif CJK SC" w:cs="Noto Sans Devanagari" w:ascii="Garamond" w:hAnsi="Garamond"/>
+          <w:color w:val="00A0FC"/>
+          <w:kern w:val="2"/>
+          <w:sz w:val="36"/>
+          <w:szCs w:val="36"/>
+          <w:lang w:val="pt-BR" w:eastAsia="zh-CN" w:bidi="hi-IN"/>
+        </w:rPr>
+        <w:t xml:space="preserve"> bastante provável que se </w:t>
+      </w:r>
+      <w:r>
+        <w:rPr>
+          <w:rFonts w:eastAsia="Noto Serif CJK SC" w:cs="Noto Sans Devanagari" w:ascii="Garamond" w:hAnsi="Garamond"/>
+          <w:color w:val="00A0FC"/>
+          <w:kern w:val="2"/>
+          <w:sz w:val="36"/>
+          <w:szCs w:val="36"/>
+          <w:lang w:val="pt-BR" w:eastAsia="zh-CN" w:bidi="hi-IN"/>
+        </w:rPr>
+        <w:t>a resposta dada pelo Espírito fosse incompleta ou imprecisa</w:t>
+      </w:r>
+      <w:r>
+        <w:rPr>
+          <w:rFonts w:eastAsia="Noto Serif CJK SC" w:cs="Noto Sans Devanagari" w:ascii="Garamond" w:hAnsi="Garamond"/>
+          <w:color w:val="00A0FC"/>
+          <w:kern w:val="2"/>
+          <w:sz w:val="36"/>
+          <w:szCs w:val="36"/>
+          <w:lang w:val="pt-BR" w:eastAsia="zh-CN" w:bidi="hi-IN"/>
+        </w:rPr>
+        <w:t xml:space="preserve">, Erasto teria adicionado uma nota </w:t>
+      </w:r>
+      <w:r>
+        <w:rPr>
+          <w:rFonts w:eastAsia="Noto Serif CJK SC" w:cs="Noto Sans Devanagari" w:ascii="Garamond" w:hAnsi="Garamond"/>
+          <w:color w:val="00A0FC"/>
+          <w:kern w:val="2"/>
+          <w:sz w:val="36"/>
+          <w:szCs w:val="36"/>
+          <w:lang w:val="pt-BR" w:eastAsia="zh-CN" w:bidi="hi-IN"/>
+        </w:rPr>
+        <w:t>complementando</w:t>
+      </w:r>
+      <w:r>
+        <w:rPr>
+          <w:rFonts w:eastAsia="Noto Serif CJK SC" w:cs="Noto Sans Devanagari" w:ascii="Garamond" w:hAnsi="Garamond"/>
+          <w:color w:val="00A0FC"/>
+          <w:kern w:val="2"/>
+          <w:sz w:val="36"/>
+          <w:szCs w:val="36"/>
+          <w:lang w:val="pt-BR" w:eastAsia="zh-CN" w:bidi="hi-IN"/>
+        </w:rPr>
+        <w:t xml:space="preserve"> a questão, </w:t>
+      </w:r>
+      <w:r>
+        <w:rPr>
+          <w:rFonts w:eastAsia="Noto Serif CJK SC" w:cs="Noto Sans Devanagari" w:ascii="Garamond" w:hAnsi="Garamond"/>
+          <w:color w:val="00A0FC"/>
+          <w:kern w:val="2"/>
+          <w:sz w:val="36"/>
+          <w:szCs w:val="36"/>
+          <w:lang w:val="pt-BR" w:eastAsia="zh-CN" w:bidi="hi-IN"/>
+        </w:rPr>
+        <w:t>como ele fez em várias outras respostas. Entretanto, Erasto não acrescentou nenhum comentário.</w:t>
+      </w:r>
+      <w:r>
+        <w:rPr>
+          <w:rFonts w:eastAsia="Noto Serif CJK SC" w:cs="Noto Sans Devanagari" w:ascii="Garamond" w:hAnsi="Garamond"/>
+          <w:color w:val="00A0FC"/>
+          <w:kern w:val="2"/>
+          <w:sz w:val="36"/>
+          <w:szCs w:val="36"/>
+          <w:lang w:val="pt-BR" w:eastAsia="zh-CN" w:bidi="hi-IN"/>
+        </w:rPr>
+        <w:t xml:space="preserve"> </w:t>
+      </w:r>
+    </w:p>
+    <w:p>
+      <w:pPr>
+        <w:pStyle w:val="Normal"/>
+        <w:bidi w:val="0"/>
+        <w:ind w:left="709" w:hanging="0"/>
+        <w:jc w:val="both"/>
+        <w:rPr>
+          <w:rFonts w:ascii="Garamond" w:hAnsi="Garamond" w:eastAsia="Noto Serif CJK SC" w:cs="Noto Sans Devanagari"/>
+          <w:color w:val="00A0FC"/>
+          <w:kern w:val="2"/>
+          <w:sz w:val="36"/>
+          <w:szCs w:val="36"/>
+          <w:lang w:val="pt-BR" w:eastAsia="zh-CN" w:bidi="hi-IN"/>
+        </w:rPr>
+      </w:pPr>
+      <w:r>
+        <w:rPr/>
+      </w:r>
+    </w:p>
+    <w:p>
+      <w:pPr>
+        <w:pStyle w:val="Normal"/>
+        <w:bidi w:val="0"/>
+        <w:ind w:left="709" w:hanging="0"/>
+        <w:jc w:val="both"/>
+        <w:rPr/>
+      </w:pPr>
+      <w:r>
+        <w:rPr>
+          <w:rFonts w:eastAsia="Noto Serif CJK SC" w:cs="Noto Sans Devanagari" w:ascii="Garamond" w:hAnsi="Garamond"/>
+          <w:color w:val="00A0FC"/>
+          <w:kern w:val="2"/>
+          <w:sz w:val="36"/>
+          <w:szCs w:val="36"/>
+          <w:lang w:val="pt-BR" w:eastAsia="zh-CN" w:bidi="hi-IN"/>
+        </w:rPr>
+        <w:t xml:space="preserve">Fica claro então que </w:t>
+      </w:r>
+      <w:r>
+        <w:rPr>
+          <w:rFonts w:eastAsia="Noto Serif CJK SC" w:cs="Noto Sans Devanagari" w:ascii="Garamond" w:hAnsi="Garamond"/>
+          <w:color w:val="00A0FC"/>
+          <w:kern w:val="2"/>
+          <w:sz w:val="36"/>
+          <w:szCs w:val="36"/>
+          <w:lang w:val="pt-BR" w:eastAsia="zh-CN" w:bidi="hi-IN"/>
+        </w:rPr>
+        <w:t xml:space="preserve">a impossibilidade de uma </w:t>
+      </w:r>
+      <w:r>
+        <w:rPr>
+          <w:rFonts w:eastAsia="Noto Serif CJK SC" w:cs="Noto Sans Devanagari" w:ascii="Garamond" w:hAnsi="Garamond"/>
+          <w:color w:val="00A0FC"/>
+          <w:kern w:val="2"/>
+          <w:sz w:val="36"/>
+          <w:szCs w:val="36"/>
+          <w:lang w:val="pt-BR" w:eastAsia="zh-CN" w:bidi="hi-IN"/>
+        </w:rPr>
+        <w:t xml:space="preserve">melhor </w:t>
+      </w:r>
+      <w:r>
+        <w:rPr>
+          <w:rFonts w:eastAsia="Noto Serif CJK SC" w:cs="Noto Sans Devanagari" w:ascii="Garamond" w:hAnsi="Garamond"/>
+          <w:color w:val="00A0FC"/>
+          <w:kern w:val="2"/>
+          <w:sz w:val="36"/>
+          <w:szCs w:val="36"/>
+          <w:lang w:val="pt-BR" w:eastAsia="zh-CN" w:bidi="hi-IN"/>
+        </w:rPr>
+        <w:t>explicação deve-se à nossa incapacidade de compreender certos fenômenos e propriedades da matéria.</w:t>
+      </w:r>
+    </w:p>
+    <w:p>
+      <w:pPr>
+        <w:pStyle w:val="Normal"/>
+        <w:bidi w:val="0"/>
+        <w:ind w:left="709" w:hanging="0"/>
+        <w:jc w:val="both"/>
+        <w:rPr>
+          <w:rFonts w:ascii="Garamond" w:hAnsi="Garamond" w:eastAsia="Noto Serif CJK SC" w:cs="Noto Sans Devanagari"/>
+          <w:color w:val="00A0FC"/>
+          <w:kern w:val="2"/>
+          <w:sz w:val="36"/>
+          <w:szCs w:val="36"/>
+          <w:lang w:val="pt-BR" w:eastAsia="zh-CN" w:bidi="hi-IN"/>
+        </w:rPr>
+      </w:pPr>
+      <w:r>
+        <w:rPr/>
+      </w:r>
+    </w:p>
+    <w:p>
+      <w:pPr>
+        <w:pStyle w:val="Normal"/>
+        <w:bidi w:val="0"/>
+        <w:ind w:left="709" w:hanging="0"/>
+        <w:jc w:val="both"/>
+        <w:rPr/>
+      </w:pPr>
+      <w:r>
+        <w:rPr>
+          <w:rFonts w:eastAsia="Noto Serif CJK SC" w:cs="Noto Sans Devanagari" w:ascii="Garamond" w:hAnsi="Garamond"/>
+          <w:color w:val="00A0FC"/>
+          <w:kern w:val="2"/>
+          <w:sz w:val="36"/>
+          <w:szCs w:val="36"/>
+          <w:lang w:val="pt-BR" w:eastAsia="zh-CN" w:bidi="hi-IN"/>
+        </w:rPr>
+        <w:t>Bom, vamos então finalmente voltar à resposta da Espiritualidade para a questão 526. Por quê eu trouxe todas essas explicações de A Gênese e O Livro dos Médiuns?</w:t>
+      </w:r>
+    </w:p>
+    <w:p>
+      <w:pPr>
+        <w:pStyle w:val="Normal"/>
+        <w:bidi w:val="0"/>
+        <w:ind w:left="709" w:hanging="0"/>
+        <w:jc w:val="both"/>
+        <w:rPr>
+          <w:rFonts w:ascii="Garamond" w:hAnsi="Garamond" w:eastAsia="Noto Serif CJK SC" w:cs="Noto Sans Devanagari"/>
+          <w:color w:val="00A0FC"/>
+          <w:kern w:val="2"/>
+          <w:sz w:val="36"/>
+          <w:szCs w:val="36"/>
+          <w:lang w:val="pt-BR" w:eastAsia="zh-CN" w:bidi="hi-IN"/>
+        </w:rPr>
+      </w:pPr>
+      <w:r>
+        <w:rPr/>
+      </w:r>
+    </w:p>
+    <w:p>
+      <w:pPr>
+        <w:pStyle w:val="Normal"/>
+        <w:bidi w:val="0"/>
+        <w:ind w:left="709" w:hanging="0"/>
+        <w:jc w:val="both"/>
+        <w:rPr/>
+      </w:pPr>
+      <w:r>
+        <w:rPr>
+          <w:rFonts w:eastAsia="Noto Serif CJK SC" w:cs="Noto Sans Devanagari" w:ascii="Garamond" w:hAnsi="Garamond"/>
+          <w:color w:val="00A0FC"/>
+          <w:kern w:val="2"/>
+          <w:sz w:val="36"/>
+          <w:szCs w:val="36"/>
+          <w:lang w:val="pt-BR" w:eastAsia="zh-CN" w:bidi="hi-IN"/>
+        </w:rPr>
+        <w:t xml:space="preserve">Porque com base em todas essas explicações nós entendemos que, sob determinadas circunstâncias, não seria impossível para um Espírito alterar - ainda que momentaneamente - as propriedades da </w:t>
+      </w:r>
+      <w:r>
+        <w:rPr>
+          <w:rFonts w:eastAsia="Noto Serif CJK SC" w:cs="Noto Sans Devanagari" w:ascii="Garamond" w:hAnsi="Garamond"/>
+          <w:color w:val="00A0FC"/>
+          <w:kern w:val="2"/>
+          <w:sz w:val="36"/>
+          <w:szCs w:val="36"/>
+          <w:lang w:val="pt-BR" w:eastAsia="zh-CN" w:bidi="hi-IN"/>
+        </w:rPr>
+        <w:t xml:space="preserve">matéria da escada  - madeira, ferro, seja lá o que fosse - </w:t>
+      </w:r>
+      <w:r>
+        <w:rPr>
+          <w:rFonts w:eastAsia="Noto Serif CJK SC" w:cs="Noto Sans Devanagari" w:ascii="Garamond" w:hAnsi="Garamond"/>
+          <w:color w:val="00A0FC"/>
+          <w:kern w:val="2"/>
+          <w:sz w:val="36"/>
+          <w:szCs w:val="36"/>
+          <w:lang w:val="pt-BR" w:eastAsia="zh-CN" w:bidi="hi-IN"/>
+        </w:rPr>
+        <w:t xml:space="preserve"> de forma que a escada na qual o homem subiu quebrasse. E isso se daria perfeitamente dentro das leis da natureza.</w:t>
+      </w:r>
+    </w:p>
+    <w:p>
+      <w:pPr>
+        <w:pStyle w:val="Normal"/>
+        <w:bidi w:val="0"/>
+        <w:ind w:left="709" w:hanging="0"/>
+        <w:jc w:val="both"/>
+        <w:rPr>
+          <w:rFonts w:ascii="Garamond" w:hAnsi="Garamond" w:eastAsia="Noto Serif CJK SC" w:cs="Noto Sans Devanagari"/>
+          <w:color w:val="00A0FC"/>
+          <w:kern w:val="2"/>
+          <w:sz w:val="36"/>
+          <w:szCs w:val="36"/>
+          <w:lang w:val="pt-BR" w:eastAsia="zh-CN" w:bidi="hi-IN"/>
+        </w:rPr>
+      </w:pPr>
+      <w:r>
+        <w:rPr/>
+      </w:r>
+    </w:p>
+    <w:p>
+      <w:pPr>
+        <w:pStyle w:val="Normal"/>
+        <w:bidi w:val="0"/>
+        <w:ind w:left="709" w:hanging="0"/>
+        <w:jc w:val="both"/>
+        <w:rPr/>
+      </w:pPr>
+      <w:r>
+        <w:rPr>
+          <w:rFonts w:eastAsia="Noto Serif CJK SC" w:cs="Noto Sans Devanagari" w:ascii="Garamond" w:hAnsi="Garamond"/>
+          <w:color w:val="00A0FC"/>
+          <w:kern w:val="2"/>
+          <w:sz w:val="36"/>
+          <w:szCs w:val="36"/>
+          <w:lang w:val="pt-BR" w:eastAsia="zh-CN" w:bidi="hi-IN"/>
+        </w:rPr>
+        <w:t xml:space="preserve">Aí vem a pergunta: então a Espiritualidade mentiu para Kardec </w:t>
+      </w:r>
+      <w:r>
+        <w:rPr>
+          <w:rFonts w:eastAsia="Noto Serif CJK SC" w:cs="Noto Sans Devanagari" w:ascii="Garamond" w:hAnsi="Garamond"/>
+          <w:color w:val="00A0FC"/>
+          <w:kern w:val="2"/>
+          <w:sz w:val="36"/>
+          <w:szCs w:val="36"/>
+          <w:lang w:val="pt-BR" w:eastAsia="zh-CN" w:bidi="hi-IN"/>
+        </w:rPr>
+        <w:t>ao dizer que, se os Espíritos atuassem para quebrar a escada, isso seria uma transgressão das leis naturais?</w:t>
+      </w:r>
+      <w:r>
+        <w:rPr>
+          <w:rFonts w:eastAsia="Noto Serif CJK SC" w:cs="Noto Sans Devanagari" w:ascii="Garamond" w:hAnsi="Garamond"/>
+          <w:color w:val="00A0FC"/>
+          <w:kern w:val="2"/>
+          <w:sz w:val="36"/>
+          <w:szCs w:val="36"/>
+          <w:lang w:val="pt-BR" w:eastAsia="zh-CN" w:bidi="hi-IN"/>
+        </w:rPr>
+        <w:t xml:space="preserve"> É óbvio que </w:t>
+      </w:r>
+      <w:r>
+        <w:rPr>
+          <w:rFonts w:eastAsia="Noto Serif CJK SC" w:cs="Noto Sans Devanagari" w:ascii="Garamond" w:hAnsi="Garamond"/>
+          <w:color w:val="00A0FC"/>
+          <w:kern w:val="2"/>
+          <w:sz w:val="36"/>
+          <w:szCs w:val="36"/>
+          <w:lang w:val="pt-BR" w:eastAsia="zh-CN" w:bidi="hi-IN"/>
+        </w:rPr>
+        <w:t>a Espiritualidade não mentiria. Cabe a nós compreender a resposta.</w:t>
+      </w:r>
+    </w:p>
+    <w:p>
+      <w:pPr>
+        <w:pStyle w:val="Normal"/>
+        <w:bidi w:val="0"/>
+        <w:ind w:left="709" w:hanging="0"/>
+        <w:jc w:val="both"/>
+        <w:rPr>
+          <w:rFonts w:ascii="Garamond" w:hAnsi="Garamond" w:eastAsia="Noto Serif CJK SC" w:cs="Noto Sans Devanagari"/>
+          <w:color w:val="00A0FC"/>
+          <w:kern w:val="2"/>
+          <w:sz w:val="36"/>
+          <w:szCs w:val="36"/>
+          <w:lang w:val="pt-BR" w:eastAsia="zh-CN" w:bidi="hi-IN"/>
+        </w:rPr>
+      </w:pPr>
+      <w:r>
+        <w:rPr/>
+      </w:r>
+    </w:p>
+    <w:p>
+      <w:pPr>
+        <w:pStyle w:val="Normal"/>
+        <w:bidi w:val="0"/>
+        <w:ind w:left="709" w:hanging="0"/>
+        <w:jc w:val="both"/>
+        <w:rPr>
+          <w:rFonts w:ascii="Garamond" w:hAnsi="Garamond" w:eastAsia="Noto Serif CJK SC" w:cs="Noto Sans Devanagari"/>
+          <w:color w:val="00A0FC"/>
+          <w:kern w:val="2"/>
+          <w:sz w:val="36"/>
+          <w:szCs w:val="36"/>
+          <w:lang w:val="pt-BR" w:eastAsia="zh-CN" w:bidi="hi-IN"/>
+        </w:rPr>
+      </w:pPr>
+      <w:r>
+        <w:rPr>
+          <w:rFonts w:eastAsia="Noto Serif CJK SC" w:cs="Noto Sans Devanagari" w:ascii="Garamond" w:hAnsi="Garamond"/>
+          <w:color w:val="00A0FC"/>
+          <w:kern w:val="2"/>
+          <w:sz w:val="36"/>
+          <w:szCs w:val="36"/>
+          <w:lang w:val="pt-BR" w:eastAsia="zh-CN" w:bidi="hi-IN"/>
+        </w:rPr>
+        <w:t xml:space="preserve">Confesso que </w:t>
+      </w:r>
+      <w:r>
+        <w:rPr>
+          <w:rFonts w:eastAsia="Noto Serif CJK SC" w:cs="Noto Sans Devanagari" w:ascii="Garamond" w:hAnsi="Garamond"/>
+          <w:color w:val="00A0FC"/>
+          <w:kern w:val="2"/>
+          <w:sz w:val="36"/>
+          <w:szCs w:val="36"/>
+          <w:lang w:val="pt-BR" w:eastAsia="zh-CN" w:bidi="hi-IN"/>
+        </w:rPr>
+        <w:t>não cheguei a uma conclusão definitiva, mas o melhor entendimento que consegui extrair da resposta da Espiritualidade é que, mesmo que seja para cumprir a Justiça Divina, os Espíritos vão atuar utilizando os meios que a natureza oferecer a eles.</w:t>
+      </w:r>
+    </w:p>
+    <w:p>
+      <w:pPr>
+        <w:pStyle w:val="Normal"/>
+        <w:bidi w:val="0"/>
+        <w:ind w:left="709" w:hanging="0"/>
+        <w:jc w:val="both"/>
+        <w:rPr>
+          <w:rFonts w:ascii="Garamond" w:hAnsi="Garamond" w:eastAsia="Noto Serif CJK SC" w:cs="Noto Sans Devanagari"/>
+          <w:color w:val="00A0FC"/>
+          <w:kern w:val="2"/>
+          <w:sz w:val="36"/>
+          <w:szCs w:val="36"/>
+          <w:lang w:val="pt-BR" w:eastAsia="zh-CN" w:bidi="hi-IN"/>
+        </w:rPr>
+      </w:pPr>
+      <w:r>
+        <w:rPr>
+          <w:rFonts w:eastAsia="Noto Serif CJK SC" w:cs="Noto Sans Devanagari" w:ascii="Garamond" w:hAnsi="Garamond"/>
+          <w:color w:val="00A0FC"/>
+          <w:kern w:val="2"/>
+          <w:sz w:val="36"/>
+          <w:szCs w:val="36"/>
+          <w:lang w:val="pt-BR" w:eastAsia="zh-CN" w:bidi="hi-IN"/>
+        </w:rPr>
+      </w:r>
+    </w:p>
+    <w:p>
+      <w:pPr>
+        <w:pStyle w:val="Normal"/>
+        <w:bidi w:val="0"/>
+        <w:ind w:left="709" w:hanging="0"/>
+        <w:jc w:val="both"/>
+        <w:rPr>
+          <w:rFonts w:ascii="Garamond" w:hAnsi="Garamond" w:eastAsia="Noto Serif CJK SC" w:cs="Noto Sans Devanagari"/>
+          <w:color w:val="00A0FC"/>
+          <w:kern w:val="2"/>
+          <w:sz w:val="36"/>
+          <w:szCs w:val="36"/>
+          <w:lang w:val="pt-BR" w:eastAsia="zh-CN" w:bidi="hi-IN"/>
+        </w:rPr>
+      </w:pPr>
+      <w:r>
+        <w:rPr>
+          <w:rFonts w:eastAsia="Noto Serif CJK SC" w:cs="Noto Sans Devanagari" w:ascii="Garamond" w:hAnsi="Garamond"/>
+          <w:color w:val="00A0FC"/>
+          <w:kern w:val="2"/>
+          <w:sz w:val="36"/>
+          <w:szCs w:val="36"/>
+          <w:lang w:val="pt-BR" w:eastAsia="zh-CN" w:bidi="hi-IN"/>
+        </w:rPr>
+        <w:t>No exemplo de Kardec o homem tem que morrer. Os Espíritos somente inspirariam a ele a ideia de subir na escada, se ela estivesse podre ou não suportasse o peso dele. Se não fosse assim, essa sugestão não seria dada ao homem pelos Espíritos. Ainda que o homem subisse na escada, nada aconteceria. Ainda que tivessem condições de quebrar a escada, os Espíritos não fariam isso só porque o homem subiu nela. Eles se utilizariam de uma outra ocasião para que a morte do homem acontecesse.</w:t>
+      </w:r>
+    </w:p>
+    <w:p>
+      <w:pPr>
+        <w:pStyle w:val="Normal"/>
+        <w:bidi w:val="0"/>
+        <w:ind w:left="709" w:hanging="0"/>
+        <w:jc w:val="both"/>
+        <w:rPr>
+          <w:rFonts w:ascii="Garamond" w:hAnsi="Garamond" w:eastAsia="Noto Serif CJK SC" w:cs="Noto Sans Devanagari"/>
+          <w:color w:val="00A0FC"/>
+          <w:kern w:val="2"/>
+          <w:sz w:val="36"/>
+          <w:szCs w:val="36"/>
+          <w:lang w:val="pt-BR" w:eastAsia="zh-CN" w:bidi="hi-IN"/>
+        </w:rPr>
+      </w:pPr>
+      <w:r>
+        <w:rPr>
+          <w:rFonts w:eastAsia="Noto Serif CJK SC" w:cs="Noto Sans Devanagari" w:ascii="Garamond" w:hAnsi="Garamond"/>
+          <w:color w:val="00A0FC"/>
+          <w:kern w:val="2"/>
+          <w:sz w:val="36"/>
+          <w:szCs w:val="36"/>
+          <w:lang w:val="pt-BR" w:eastAsia="zh-CN" w:bidi="hi-IN"/>
+        </w:rPr>
+      </w:r>
+    </w:p>
+    <w:p>
+      <w:pPr>
+        <w:pStyle w:val="Normal"/>
+        <w:bidi w:val="0"/>
+        <w:ind w:left="709" w:hanging="0"/>
+        <w:jc w:val="both"/>
+        <w:rPr>
+          <w:rFonts w:ascii="Garamond" w:hAnsi="Garamond" w:eastAsia="Noto Serif CJK SC" w:cs="Noto Sans Devanagari"/>
+          <w:color w:val="00A0FC"/>
+          <w:kern w:val="2"/>
+          <w:sz w:val="36"/>
+          <w:szCs w:val="36"/>
+          <w:lang w:val="pt-BR" w:eastAsia="zh-CN" w:bidi="hi-IN"/>
+        </w:rPr>
+      </w:pPr>
+      <w:r>
+        <w:rPr>
+          <w:rFonts w:eastAsia="Noto Serif CJK SC" w:cs="Noto Sans Devanagari" w:ascii="Garamond" w:hAnsi="Garamond"/>
+          <w:color w:val="00A0FC"/>
+          <w:kern w:val="2"/>
+          <w:sz w:val="36"/>
+          <w:szCs w:val="36"/>
+          <w:lang w:val="pt-BR" w:eastAsia="zh-CN" w:bidi="hi-IN"/>
+        </w:rPr>
+        <w:t xml:space="preserve">Kardec deu o exemplo de um homem cuja morte precisa acontecer. Então era algo já planejado na atual existência daquele homem. </w:t>
+      </w:r>
+    </w:p>
+    <w:p>
+      <w:pPr>
+        <w:pStyle w:val="Normal"/>
+        <w:bidi w:val="0"/>
+        <w:ind w:left="709" w:hanging="0"/>
+        <w:jc w:val="both"/>
+        <w:rPr>
+          <w:rFonts w:ascii="Garamond" w:hAnsi="Garamond" w:eastAsia="Noto Serif CJK SC" w:cs="Noto Sans Devanagari"/>
+          <w:color w:val="00A0FC"/>
+          <w:kern w:val="2"/>
+          <w:sz w:val="36"/>
+          <w:szCs w:val="36"/>
+          <w:lang w:val="pt-BR" w:eastAsia="zh-CN" w:bidi="hi-IN"/>
+        </w:rPr>
+      </w:pPr>
+      <w:r>
+        <w:rPr>
+          <w:rFonts w:eastAsia="Noto Serif CJK SC" w:cs="Noto Sans Devanagari" w:ascii="Garamond" w:hAnsi="Garamond"/>
+          <w:color w:val="00A0FC"/>
+          <w:kern w:val="2"/>
+          <w:sz w:val="36"/>
+          <w:szCs w:val="36"/>
+          <w:lang w:val="pt-BR" w:eastAsia="zh-CN" w:bidi="hi-IN"/>
+        </w:rPr>
+      </w:r>
+    </w:p>
+    <w:p>
+      <w:pPr>
+        <w:pStyle w:val="Normal"/>
+        <w:bidi w:val="0"/>
+        <w:ind w:left="709" w:hanging="0"/>
+        <w:jc w:val="both"/>
+        <w:rPr>
+          <w:rFonts w:ascii="Garamond" w:hAnsi="Garamond" w:eastAsia="Noto Serif CJK SC" w:cs="Noto Sans Devanagari"/>
+          <w:color w:val="00A0FC"/>
+          <w:kern w:val="2"/>
+          <w:sz w:val="36"/>
+          <w:szCs w:val="36"/>
+          <w:lang w:val="pt-BR" w:eastAsia="zh-CN" w:bidi="hi-IN"/>
+        </w:rPr>
+      </w:pPr>
+      <w:r>
+        <w:rPr>
+          <w:rFonts w:eastAsia="Noto Serif CJK SC" w:cs="Noto Sans Devanagari" w:ascii="Garamond" w:hAnsi="Garamond"/>
+          <w:color w:val="00A0FC"/>
+          <w:kern w:val="2"/>
+          <w:sz w:val="36"/>
+          <w:szCs w:val="36"/>
+          <w:lang w:val="pt-BR" w:eastAsia="zh-CN" w:bidi="hi-IN"/>
+        </w:rPr>
+        <w:t>Agora vamos pensar o seguinte: qual seria então o poder de atuação dos Espíritos se fossem eles que quisessem matar aquele homem? O homem é um inimigo deles e sobe na escada. Teriam eles o poder de quebrar a escada estando ela em boas condições? De acordo com a resposta da Espiritualidade, não. Os Espíritos não teriam autorização para quebrar a escada.</w:t>
+      </w:r>
+    </w:p>
+    <w:p>
+      <w:pPr>
+        <w:pStyle w:val="Normal"/>
+        <w:bidi w:val="0"/>
+        <w:ind w:left="709" w:hanging="0"/>
+        <w:jc w:val="both"/>
+        <w:rPr>
+          <w:rFonts w:ascii="Garamond" w:hAnsi="Garamond" w:eastAsia="Noto Serif CJK SC" w:cs="Noto Sans Devanagari"/>
+          <w:color w:val="00A0FC"/>
+          <w:kern w:val="2"/>
+          <w:sz w:val="36"/>
+          <w:szCs w:val="36"/>
+          <w:lang w:val="pt-BR" w:eastAsia="zh-CN" w:bidi="hi-IN"/>
+        </w:rPr>
+      </w:pPr>
+      <w:r>
+        <w:rPr>
+          <w:rFonts w:eastAsia="Noto Serif CJK SC" w:cs="Noto Sans Devanagari" w:ascii="Garamond" w:hAnsi="Garamond"/>
+          <w:color w:val="00A0FC"/>
+          <w:kern w:val="2"/>
+          <w:sz w:val="36"/>
+          <w:szCs w:val="36"/>
+          <w:lang w:val="pt-BR" w:eastAsia="zh-CN" w:bidi="hi-IN"/>
+        </w:rPr>
+      </w:r>
+    </w:p>
+    <w:p>
+      <w:pPr>
+        <w:pStyle w:val="Normal"/>
+        <w:bidi w:val="0"/>
+        <w:ind w:left="709" w:hanging="0"/>
+        <w:jc w:val="both"/>
+        <w:rPr>
+          <w:rFonts w:ascii="Garamond" w:hAnsi="Garamond" w:eastAsia="Noto Serif CJK SC" w:cs="Noto Sans Devanagari"/>
+          <w:color w:val="00A0FC"/>
+          <w:kern w:val="2"/>
+          <w:sz w:val="36"/>
+          <w:szCs w:val="36"/>
+          <w:lang w:val="pt-BR" w:eastAsia="zh-CN" w:bidi="hi-IN"/>
+        </w:rPr>
+      </w:pPr>
+      <w:r>
+        <w:rPr>
+          <w:rFonts w:eastAsia="Noto Serif CJK SC" w:cs="Noto Sans Devanagari" w:ascii="Garamond" w:hAnsi="Garamond"/>
+          <w:color w:val="00A0FC"/>
+          <w:kern w:val="2"/>
+          <w:sz w:val="36"/>
+          <w:szCs w:val="36"/>
+          <w:lang w:val="pt-BR" w:eastAsia="zh-CN" w:bidi="hi-IN"/>
+        </w:rPr>
+        <w:t>Imaginem a quantidade de acidentes e eventos catastróficos que aconteceriam se os inimigos desencarnados pudessem manipular a matéria como bem entendessem de maneira a se vingarem dos inimigos encarnados? A vida se tornaria um caos. De nada adiantaria o homem ser previdente, cauteloso, seguro, pois a qualquer momento um Espírito poderia atuar sobre a matéria contrariando completamente todo o cuidado que aquele homem teve. Isso seria uma derrogação das leis de Deus.</w:t>
+      </w:r>
+    </w:p>
+    <w:p>
+      <w:pPr>
+        <w:pStyle w:val="Normal"/>
+        <w:bidi w:val="0"/>
+        <w:ind w:left="709" w:hanging="0"/>
+        <w:jc w:val="both"/>
+        <w:rPr>
+          <w:rFonts w:ascii="Garamond" w:hAnsi="Garamond" w:eastAsia="Noto Serif CJK SC" w:cs="Noto Sans Devanagari"/>
+          <w:color w:val="00A0FC"/>
+          <w:kern w:val="2"/>
+          <w:sz w:val="36"/>
+          <w:szCs w:val="36"/>
+          <w:lang w:val="pt-BR" w:eastAsia="zh-CN" w:bidi="hi-IN"/>
+        </w:rPr>
+      </w:pPr>
+      <w:r>
+        <w:rPr>
+          <w:rFonts w:eastAsia="Noto Serif CJK SC" w:cs="Noto Sans Devanagari" w:ascii="Garamond" w:hAnsi="Garamond"/>
+          <w:color w:val="00A0FC"/>
+          <w:kern w:val="2"/>
+          <w:sz w:val="36"/>
+          <w:szCs w:val="36"/>
+          <w:lang w:val="pt-BR" w:eastAsia="zh-CN" w:bidi="hi-IN"/>
+        </w:rPr>
+      </w:r>
+    </w:p>
+    <w:p>
+      <w:pPr>
+        <w:pStyle w:val="Normal"/>
+        <w:bidi w:val="0"/>
+        <w:ind w:left="709" w:hanging="0"/>
+        <w:jc w:val="both"/>
+        <w:rPr>
+          <w:rFonts w:ascii="Garamond" w:hAnsi="Garamond" w:eastAsia="Noto Serif CJK SC" w:cs="Noto Sans Devanagari"/>
+          <w:color w:val="00A0FC"/>
+          <w:kern w:val="2"/>
+          <w:sz w:val="36"/>
+          <w:szCs w:val="36"/>
+          <w:lang w:val="pt-BR" w:eastAsia="zh-CN" w:bidi="hi-IN"/>
+        </w:rPr>
+      </w:pPr>
+      <w:r>
+        <w:rPr>
+          <w:rFonts w:eastAsia="Noto Serif CJK SC" w:cs="Noto Sans Devanagari" w:ascii="Garamond" w:hAnsi="Garamond"/>
+          <w:color w:val="00A0FC"/>
+          <w:kern w:val="2"/>
+          <w:sz w:val="36"/>
+          <w:szCs w:val="36"/>
+          <w:lang w:val="pt-BR" w:eastAsia="zh-CN" w:bidi="hi-IN"/>
+        </w:rPr>
+        <w:t xml:space="preserve">Então o que podemos deduzir da resposta da Espiritualidade é que, embora os Espíritos possam atuar sobre a matéria, eles não têm a liberdade de manipulá-la como bem entendem. Ainda que seja para atender um desígnio de Deus, os Espíritos se utilizariam de condições naturais já estabelecidas para fazer </w:t>
+      </w:r>
+      <w:r>
+        <w:rPr>
+          <w:rFonts w:eastAsia="Noto Serif CJK SC" w:cs="Noto Sans Devanagari" w:ascii="Garamond" w:hAnsi="Garamond"/>
+          <w:color w:val="00A0FC"/>
+          <w:kern w:val="2"/>
+          <w:sz w:val="36"/>
+          <w:szCs w:val="36"/>
+          <w:lang w:val="pt-BR" w:eastAsia="zh-CN" w:bidi="hi-IN"/>
+        </w:rPr>
+        <w:t xml:space="preserve"> </w:t>
+      </w:r>
+      <w:r>
+        <w:rPr>
+          <w:rFonts w:eastAsia="Noto Serif CJK SC" w:cs="Noto Sans Devanagari" w:ascii="Garamond" w:hAnsi="Garamond"/>
+          <w:color w:val="00A0FC"/>
+          <w:kern w:val="2"/>
+          <w:sz w:val="36"/>
+          <w:szCs w:val="36"/>
+          <w:lang w:val="pt-BR" w:eastAsia="zh-CN" w:bidi="hi-IN"/>
+        </w:rPr>
+        <w:t>cumprir a vontade do Pai.</w:t>
+      </w:r>
+    </w:p>
+    <w:p>
+      <w:pPr>
+        <w:pStyle w:val="Normal"/>
+        <w:bidi w:val="0"/>
+        <w:ind w:left="709" w:hanging="0"/>
+        <w:jc w:val="both"/>
+        <w:rPr>
+          <w:rFonts w:ascii="Garamond" w:hAnsi="Garamond" w:eastAsia="Noto Serif CJK SC" w:cs="Noto Sans Devanagari"/>
+          <w:color w:val="00A0FC"/>
+          <w:kern w:val="2"/>
+          <w:sz w:val="36"/>
+          <w:szCs w:val="36"/>
+          <w:lang w:val="pt-BR" w:eastAsia="zh-CN" w:bidi="hi-IN"/>
+        </w:rPr>
+      </w:pPr>
+      <w:r>
+        <w:rPr>
+          <w:rFonts w:eastAsia="Noto Serif CJK SC" w:cs="Noto Sans Devanagari" w:ascii="Garamond" w:hAnsi="Garamond"/>
+          <w:color w:val="00A0FC"/>
+          <w:kern w:val="2"/>
+          <w:sz w:val="36"/>
+          <w:szCs w:val="36"/>
+          <w:lang w:val="pt-BR" w:eastAsia="zh-CN" w:bidi="hi-IN"/>
+        </w:rPr>
+      </w:r>
+    </w:p>
+    <w:p>
+      <w:pPr>
+        <w:pStyle w:val="Normal"/>
+        <w:bidi w:val="0"/>
+        <w:jc w:val="both"/>
+        <w:rPr>
+          <w:rFonts w:ascii="Garamond" w:hAnsi="Garamond"/>
+          <w:sz w:val="36"/>
+          <w:szCs w:val="36"/>
+        </w:rPr>
+      </w:pPr>
+      <w:r>
+        <w:rPr>
+          <w:rFonts w:eastAsia="Noto Serif CJK SC" w:cs="Noto Sans Devanagari" w:ascii="Garamond" w:hAnsi="Garamond"/>
+          <w:color w:val="auto"/>
+          <w:kern w:val="2"/>
+          <w:sz w:val="36"/>
+          <w:szCs w:val="36"/>
+          <w:lang w:val="pt-BR" w:eastAsia="zh-CN" w:bidi="hi-IN"/>
+        </w:rPr>
+        <w:t>52</w:t>
+      </w:r>
+      <w:r>
+        <w:rPr>
+          <w:rFonts w:eastAsia="Noto Serif CJK SC" w:cs="Noto Sans Devanagari" w:ascii="Garamond" w:hAnsi="Garamond"/>
+          <w:color w:val="auto"/>
+          <w:kern w:val="2"/>
+          <w:sz w:val="36"/>
+          <w:szCs w:val="36"/>
+          <w:lang w:val="pt-BR" w:eastAsia="zh-CN" w:bidi="hi-IN"/>
+        </w:rPr>
+        <w:t>7</w:t>
+      </w:r>
+      <w:r>
+        <w:rPr>
+          <w:rFonts w:ascii="Garamond" w:hAnsi="Garamond"/>
+          <w:sz w:val="36"/>
+          <w:szCs w:val="36"/>
+        </w:rPr>
+        <w:t>. Tomemos outro exemplo, em que não entre a matéria em seu estado</w:t>
+      </w:r>
+      <w:r>
+        <w:rPr>
+          <w:rFonts w:ascii="Garamond" w:hAnsi="Garamond"/>
+          <w:sz w:val="36"/>
+          <w:szCs w:val="36"/>
+        </w:rPr>
+        <w:t xml:space="preserve"> </w:t>
+      </w:r>
+      <w:r>
+        <w:rPr>
+          <w:rFonts w:ascii="Garamond" w:hAnsi="Garamond"/>
+          <w:sz w:val="36"/>
+          <w:szCs w:val="36"/>
+        </w:rPr>
+        <w:t>natural. Um homem tem que morrer fulminado pelo raio. Refugia-se</w:t>
+      </w:r>
+      <w:r>
+        <w:rPr>
+          <w:rFonts w:ascii="Garamond" w:hAnsi="Garamond"/>
+          <w:sz w:val="36"/>
+          <w:szCs w:val="36"/>
+        </w:rPr>
+        <w:t xml:space="preserve"> </w:t>
+      </w:r>
+      <w:r>
+        <w:rPr>
+          <w:rFonts w:ascii="Garamond" w:hAnsi="Garamond"/>
+          <w:sz w:val="36"/>
+          <w:szCs w:val="36"/>
+        </w:rPr>
+        <w:t>debaixo de uma árvore. Estala o raio e o mata. Poderá dar-se tenham</w:t>
+      </w:r>
+      <w:r>
+        <w:rPr>
+          <w:rFonts w:ascii="Garamond" w:hAnsi="Garamond"/>
+          <w:sz w:val="36"/>
+          <w:szCs w:val="36"/>
+        </w:rPr>
+        <w:t xml:space="preserve"> </w:t>
+      </w:r>
+      <w:r>
+        <w:rPr>
+          <w:rFonts w:ascii="Garamond" w:hAnsi="Garamond"/>
+          <w:sz w:val="36"/>
+          <w:szCs w:val="36"/>
+        </w:rPr>
+        <w:t>sido os Espíritos que provocaram a produção do raio e que o dirigiram para o homem?</w:t>
+      </w:r>
+    </w:p>
+    <w:p>
+      <w:pPr>
+        <w:pStyle w:val="Normal"/>
+        <w:bidi w:val="0"/>
+        <w:jc w:val="both"/>
+        <w:rPr>
+          <w:rFonts w:ascii="Garamond" w:hAnsi="Garamond"/>
+          <w:sz w:val="36"/>
+          <w:szCs w:val="36"/>
+        </w:rPr>
+      </w:pPr>
+      <w:r>
+        <w:rPr>
+          <w:rFonts w:ascii="Garamond" w:hAnsi="Garamond"/>
+          <w:sz w:val="36"/>
+          <w:szCs w:val="36"/>
+        </w:rPr>
+      </w:r>
+    </w:p>
+    <w:p>
+      <w:pPr>
+        <w:pStyle w:val="Normal"/>
+        <w:bidi w:val="0"/>
+        <w:ind w:hanging="0"/>
+        <w:jc w:val="both"/>
+        <w:rPr>
+          <w:rFonts w:ascii="Garamond" w:hAnsi="Garamond"/>
+          <w:sz w:val="36"/>
+          <w:szCs w:val="36"/>
+        </w:rPr>
+      </w:pPr>
+      <w:r>
+        <w:rPr>
+          <w:rFonts w:ascii="Garamond" w:hAnsi="Garamond"/>
+          <w:i/>
+          <w:iCs/>
+          <w:sz w:val="36"/>
+          <w:szCs w:val="36"/>
+        </w:rPr>
+        <w:t>“</w:t>
+      </w:r>
+      <w:r>
+        <w:rPr>
+          <w:rFonts w:ascii="Garamond" w:hAnsi="Garamond"/>
+          <w:i/>
+          <w:iCs/>
+          <w:sz w:val="36"/>
+          <w:szCs w:val="36"/>
+        </w:rPr>
+        <w:t>Dá-se o mesmo que anteriormente. O raio caiu sobre aquela</w:t>
+      </w:r>
+      <w:r>
+        <w:rPr>
+          <w:rFonts w:ascii="Garamond" w:hAnsi="Garamond"/>
+          <w:i/>
+          <w:iCs/>
+          <w:sz w:val="36"/>
+          <w:szCs w:val="36"/>
+        </w:rPr>
+        <w:t xml:space="preserve"> </w:t>
+      </w:r>
+      <w:r>
+        <w:rPr>
+          <w:rFonts w:ascii="Garamond" w:hAnsi="Garamond"/>
+          <w:i/>
+          <w:iCs/>
+          <w:sz w:val="36"/>
+          <w:szCs w:val="36"/>
+        </w:rPr>
+        <w:t>árvore em tal momento, porque estava nas Leis da Natureza que</w:t>
+      </w:r>
+      <w:r>
+        <w:rPr>
+          <w:rFonts w:ascii="Garamond" w:hAnsi="Garamond"/>
+          <w:i/>
+          <w:iCs/>
+          <w:sz w:val="36"/>
+          <w:szCs w:val="36"/>
+        </w:rPr>
+        <w:t xml:space="preserve"> </w:t>
+      </w:r>
+      <w:r>
+        <w:rPr>
+          <w:rFonts w:ascii="Garamond" w:hAnsi="Garamond"/>
+          <w:i/>
+          <w:iCs/>
+          <w:sz w:val="36"/>
+          <w:szCs w:val="36"/>
+        </w:rPr>
+        <w:t>assim acontecesse. Não foi encaminhado para a árvore, por se</w:t>
+      </w:r>
+      <w:r>
+        <w:rPr>
+          <w:rFonts w:ascii="Garamond" w:hAnsi="Garamond"/>
+          <w:i/>
+          <w:iCs/>
+          <w:sz w:val="36"/>
+          <w:szCs w:val="36"/>
+        </w:rPr>
+        <w:t xml:space="preserve"> </w:t>
+      </w:r>
+      <w:r>
+        <w:rPr>
+          <w:rFonts w:ascii="Garamond" w:hAnsi="Garamond"/>
+          <w:i/>
+          <w:iCs/>
+          <w:sz w:val="36"/>
+          <w:szCs w:val="36"/>
+        </w:rPr>
+        <w:t>achar debaixo dela o homem. A este, sim, foi inspirada a ideia de</w:t>
+      </w:r>
+      <w:r>
+        <w:rPr>
+          <w:rFonts w:ascii="Garamond" w:hAnsi="Garamond"/>
+          <w:i/>
+          <w:iCs/>
+          <w:sz w:val="36"/>
+          <w:szCs w:val="36"/>
+        </w:rPr>
+        <w:t xml:space="preserve"> </w:t>
+      </w:r>
+      <w:r>
+        <w:rPr>
+          <w:rFonts w:ascii="Garamond" w:hAnsi="Garamond"/>
+          <w:i/>
+          <w:iCs/>
+          <w:sz w:val="36"/>
+          <w:szCs w:val="36"/>
+        </w:rPr>
+        <w:t>se abrigar debaixo de uma árvore sobre a qual cairia o raio, porquanto a árvore não deixaria de ser atingida, só por não lhe estar</w:t>
+      </w:r>
+      <w:r>
+        <w:rPr>
+          <w:rFonts w:ascii="Garamond" w:hAnsi="Garamond"/>
+          <w:i/>
+          <w:iCs/>
+          <w:sz w:val="36"/>
+          <w:szCs w:val="36"/>
+        </w:rPr>
+        <w:t xml:space="preserve"> </w:t>
+      </w:r>
+      <w:r>
+        <w:rPr>
+          <w:rFonts w:ascii="Garamond" w:hAnsi="Garamond"/>
+          <w:i/>
+          <w:iCs/>
+          <w:sz w:val="36"/>
+          <w:szCs w:val="36"/>
+        </w:rPr>
+        <w:t>debaixo da fronde o homem.”</w:t>
+      </w:r>
+    </w:p>
+    <w:p>
+      <w:pPr>
+        <w:pStyle w:val="Normal"/>
+        <w:bidi w:val="0"/>
+        <w:ind w:left="709" w:hanging="0"/>
+        <w:jc w:val="both"/>
+        <w:rPr>
+          <w:rFonts w:ascii="Garamond" w:hAnsi="Garamond" w:eastAsia="Noto Serif CJK SC" w:cs="Noto Sans Devanagari"/>
+          <w:i w:val="false"/>
+          <w:i w:val="false"/>
+          <w:iCs w:val="false"/>
+          <w:color w:val="00A0FC"/>
+          <w:kern w:val="2"/>
+          <w:sz w:val="36"/>
+          <w:szCs w:val="36"/>
+          <w:lang w:val="pt-BR" w:eastAsia="zh-CN" w:bidi="hi-IN"/>
+        </w:rPr>
+      </w:pPr>
+      <w:r>
+        <w:rPr>
+          <w:rFonts w:eastAsia="Noto Serif CJK SC" w:cs="Noto Sans Devanagari" w:ascii="Garamond" w:hAnsi="Garamond"/>
+          <w:i w:val="false"/>
+          <w:iCs w:val="false"/>
+          <w:color w:val="00A0FC"/>
+          <w:kern w:val="2"/>
+          <w:sz w:val="36"/>
+          <w:szCs w:val="36"/>
+          <w:lang w:val="pt-BR" w:eastAsia="zh-CN" w:bidi="hi-IN"/>
+        </w:rPr>
+      </w:r>
+    </w:p>
+    <w:p>
+      <w:pPr>
+        <w:pStyle w:val="Normal"/>
+        <w:bidi w:val="0"/>
+        <w:ind w:left="709" w:hanging="0"/>
+        <w:jc w:val="both"/>
+        <w:rPr>
+          <w:rFonts w:ascii="Garamond" w:hAnsi="Garamond"/>
+          <w:color w:val="00A0FC"/>
+          <w:sz w:val="36"/>
+          <w:szCs w:val="36"/>
+        </w:rPr>
+      </w:pPr>
+      <w:r>
+        <w:rPr>
+          <w:rFonts w:eastAsia="Noto Serif CJK SC" w:cs="Noto Sans Devanagari" w:ascii="Garamond" w:hAnsi="Garamond"/>
+          <w:i w:val="false"/>
+          <w:iCs w:val="false"/>
+          <w:color w:val="00A0FC"/>
+          <w:kern w:val="2"/>
+          <w:sz w:val="36"/>
+          <w:szCs w:val="36"/>
+          <w:lang w:val="pt-BR" w:eastAsia="zh-CN" w:bidi="hi-IN"/>
+        </w:rPr>
+        <w:t>Pergunta muito semelhante à anterior, mas aqui Kardec altera o elemento que sofre a ação dos Espíritos: em vez de ser o material da escada, passa a ser um elemento da natureza — no caso, um raio. Em vez de alterar a matéria da escada, os Espíritos produziriam o raio que haveria de matar o homem.</w:t>
+      </w:r>
+    </w:p>
+    <w:p>
+      <w:pPr>
+        <w:pStyle w:val="Normal"/>
+        <w:bidi w:val="0"/>
+        <w:ind w:left="709" w:hanging="0"/>
+        <w:jc w:val="both"/>
+        <w:rPr>
+          <w:rFonts w:ascii="Garamond" w:hAnsi="Garamond"/>
+          <w:color w:val="00A0FC"/>
+          <w:sz w:val="36"/>
+          <w:szCs w:val="36"/>
+        </w:rPr>
+      </w:pPr>
+      <w:r>
+        <w:rPr/>
+      </w:r>
+    </w:p>
+    <w:p>
+      <w:pPr>
+        <w:pStyle w:val="Normal"/>
+        <w:bidi w:val="0"/>
+        <w:ind w:left="709" w:hanging="0"/>
+        <w:jc w:val="both"/>
+        <w:rPr>
+          <w:rFonts w:ascii="Garamond" w:hAnsi="Garamond"/>
+          <w:color w:val="00A0FC"/>
+          <w:sz w:val="36"/>
+          <w:szCs w:val="36"/>
+        </w:rPr>
+      </w:pPr>
+      <w:r>
+        <w:rPr>
+          <w:rFonts w:eastAsia="Noto Serif CJK SC" w:cs="Noto Sans Devanagari" w:ascii="Garamond" w:hAnsi="Garamond"/>
+          <w:i w:val="false"/>
+          <w:iCs w:val="false"/>
+          <w:color w:val="00A0FC"/>
+          <w:kern w:val="2"/>
+          <w:sz w:val="36"/>
+          <w:szCs w:val="36"/>
+          <w:lang w:val="pt-BR" w:eastAsia="zh-CN" w:bidi="hi-IN"/>
+        </w:rPr>
+        <w:t>A Espiritualidade responde que a situação é a mesma. Embora existam Espíritos responsáveis por produzir os mais variados fenômenos da natureza — vulcões, maremotos, tempestades etc. — sempre de acordo com os desígnios de Deus, assunto que estudaremos em breve, no exemplo dado por Kardec não haveria a produção do raio exclusivamente para causar a morte do homem. O raio atingiria a árvore de qualquer maneira, estando o homem debaixo dela ou não. Trata-se de um fenômeno natural.</w:t>
+      </w:r>
+    </w:p>
+    <w:p>
+      <w:pPr>
+        <w:pStyle w:val="Normal"/>
+        <w:bidi w:val="0"/>
+        <w:ind w:left="709" w:hanging="0"/>
+        <w:jc w:val="both"/>
+        <w:rPr>
+          <w:rFonts w:ascii="Garamond" w:hAnsi="Garamond"/>
+          <w:color w:val="00A0FC"/>
+          <w:sz w:val="36"/>
+          <w:szCs w:val="36"/>
+        </w:rPr>
+      </w:pPr>
+      <w:r>
+        <w:rPr/>
+      </w:r>
+    </w:p>
+    <w:p>
+      <w:pPr>
+        <w:pStyle w:val="Normal"/>
+        <w:bidi w:val="0"/>
+        <w:ind w:left="709" w:hanging="0"/>
+        <w:jc w:val="both"/>
+        <w:rPr>
+          <w:rFonts w:ascii="Garamond" w:hAnsi="Garamond"/>
+          <w:color w:val="00A0FC"/>
+          <w:sz w:val="36"/>
+          <w:szCs w:val="36"/>
+        </w:rPr>
+      </w:pPr>
+      <w:r>
+        <w:rPr>
+          <w:rFonts w:eastAsia="Noto Serif CJK SC" w:cs="Noto Sans Devanagari" w:ascii="Garamond" w:hAnsi="Garamond"/>
+          <w:i w:val="false"/>
+          <w:iCs w:val="false"/>
+          <w:color w:val="00A0FC"/>
+          <w:kern w:val="2"/>
+          <w:sz w:val="36"/>
+          <w:szCs w:val="36"/>
+          <w:lang w:val="pt-BR" w:eastAsia="zh-CN" w:bidi="hi-IN"/>
+        </w:rPr>
+        <w:t>Se o homem tivesse de morrer atingido pelo raio, o que os Espíritos fariam seria sugerir-lhe que se abrigasse debaixo da árvore, de modo que viesse a ser atingido pela descarga</w:t>
+      </w:r>
+      <w:r>
+        <w:rPr>
+          <w:rFonts w:eastAsia="Noto Serif CJK SC" w:cs="Noto Sans Devanagari" w:ascii="Garamond" w:hAnsi="Garamond"/>
+          <w:i w:val="false"/>
+          <w:iCs w:val="false"/>
+          <w:color w:val="00A0FC"/>
+          <w:kern w:val="2"/>
+          <w:sz w:val="36"/>
+          <w:szCs w:val="36"/>
+          <w:lang w:val="pt-BR" w:eastAsia="zh-CN" w:bidi="hi-IN"/>
+        </w:rPr>
+        <w:t xml:space="preserve"> e assim desencarnasse.</w:t>
+      </w:r>
+    </w:p>
+    <w:p>
+      <w:pPr>
+        <w:pStyle w:val="Normal"/>
+        <w:bidi w:val="0"/>
+        <w:ind w:left="709" w:hanging="0"/>
+        <w:jc w:val="both"/>
+        <w:rPr>
+          <w:rFonts w:ascii="Garamond" w:hAnsi="Garamond"/>
+          <w:color w:val="00A0FC"/>
+          <w:sz w:val="36"/>
+          <w:szCs w:val="36"/>
+        </w:rPr>
+      </w:pPr>
+      <w:r>
+        <w:rPr/>
+      </w:r>
+    </w:p>
+    <w:p>
+      <w:pPr>
+        <w:pStyle w:val="Normal"/>
+        <w:bidi w:val="0"/>
+        <w:ind w:left="709" w:hanging="0"/>
+        <w:jc w:val="both"/>
+        <w:rPr>
+          <w:rFonts w:ascii="Garamond" w:hAnsi="Garamond"/>
+          <w:color w:val="00A0FC"/>
+          <w:sz w:val="36"/>
+          <w:szCs w:val="36"/>
+        </w:rPr>
+      </w:pPr>
+      <w:r>
+        <w:rPr/>
+      </w:r>
+    </w:p>
+    <w:p>
+      <w:pPr>
+        <w:pStyle w:val="Normal"/>
+        <w:bidi w:val="0"/>
+        <w:jc w:val="both"/>
+        <w:rPr>
+          <w:rFonts w:ascii="Garamond" w:hAnsi="Garamond"/>
+          <w:sz w:val="36"/>
+          <w:szCs w:val="36"/>
+        </w:rPr>
+      </w:pPr>
+      <w:r>
+        <w:rPr>
+          <w:rFonts w:eastAsia="Noto Serif CJK SC" w:cs="Noto Sans Devanagari" w:ascii="Garamond" w:hAnsi="Garamond"/>
+          <w:color w:val="auto"/>
+          <w:kern w:val="2"/>
+          <w:sz w:val="36"/>
+          <w:szCs w:val="36"/>
+          <w:lang w:val="pt-BR" w:eastAsia="zh-CN" w:bidi="hi-IN"/>
+        </w:rPr>
+        <w:t>52</w:t>
+      </w:r>
+      <w:r>
+        <w:rPr>
+          <w:rFonts w:eastAsia="Noto Serif CJK SC" w:cs="Noto Sans Devanagari" w:ascii="Garamond" w:hAnsi="Garamond"/>
+          <w:color w:val="auto"/>
+          <w:kern w:val="2"/>
+          <w:sz w:val="36"/>
+          <w:szCs w:val="36"/>
+          <w:lang w:val="pt-BR" w:eastAsia="zh-CN" w:bidi="hi-IN"/>
+        </w:rPr>
+        <w:t>8</w:t>
+      </w:r>
+      <w:r>
+        <w:rPr>
+          <w:rFonts w:ascii="Garamond" w:hAnsi="Garamond"/>
+          <w:sz w:val="36"/>
+          <w:szCs w:val="36"/>
+        </w:rPr>
+        <w:t>. No caso de uma pessoa mal-intencionada disparar sobre outra um</w:t>
+      </w:r>
+      <w:r>
+        <w:rPr>
+          <w:rFonts w:ascii="Garamond" w:hAnsi="Garamond"/>
+          <w:sz w:val="36"/>
+          <w:szCs w:val="36"/>
+        </w:rPr>
+        <w:t xml:space="preserve"> </w:t>
+      </w:r>
+      <w:r>
+        <w:rPr>
+          <w:rFonts w:ascii="Garamond" w:hAnsi="Garamond"/>
+          <w:sz w:val="36"/>
+          <w:szCs w:val="36"/>
+        </w:rPr>
+        <w:t>projetil que apenas lhe passe perto sem a atingir, poderá ter sucedido</w:t>
+      </w:r>
+      <w:r>
+        <w:rPr>
+          <w:rFonts w:ascii="Garamond" w:hAnsi="Garamond"/>
+          <w:sz w:val="36"/>
+          <w:szCs w:val="36"/>
+        </w:rPr>
+        <w:t xml:space="preserve"> </w:t>
+      </w:r>
+      <w:r>
+        <w:rPr>
+          <w:rFonts w:ascii="Garamond" w:hAnsi="Garamond"/>
+          <w:sz w:val="36"/>
+          <w:szCs w:val="36"/>
+        </w:rPr>
+        <w:t>que um Espírito bondoso haja desviado o projetil?</w:t>
+      </w:r>
+    </w:p>
+    <w:p>
+      <w:pPr>
+        <w:pStyle w:val="Normal"/>
+        <w:bidi w:val="0"/>
+        <w:jc w:val="both"/>
+        <w:rPr>
+          <w:rFonts w:ascii="Garamond" w:hAnsi="Garamond"/>
+          <w:sz w:val="36"/>
+          <w:szCs w:val="36"/>
+        </w:rPr>
+      </w:pPr>
+      <w:r>
+        <w:rPr>
+          <w:rFonts w:ascii="Garamond" w:hAnsi="Garamond"/>
+          <w:sz w:val="36"/>
+          <w:szCs w:val="36"/>
+        </w:rPr>
+      </w:r>
+    </w:p>
+    <w:p>
+      <w:pPr>
+        <w:pStyle w:val="Normal"/>
+        <w:bidi w:val="0"/>
+        <w:ind w:hanging="0"/>
+        <w:jc w:val="both"/>
+        <w:rPr>
+          <w:rFonts w:ascii="Garamond" w:hAnsi="Garamond"/>
+          <w:sz w:val="36"/>
+          <w:szCs w:val="36"/>
+        </w:rPr>
+      </w:pPr>
+      <w:r>
+        <w:rPr>
+          <w:rFonts w:ascii="Garamond" w:hAnsi="Garamond"/>
+          <w:i/>
+          <w:iCs/>
+          <w:sz w:val="36"/>
+          <w:szCs w:val="36"/>
+        </w:rPr>
+        <w:t>“</w:t>
+      </w:r>
+      <w:r>
+        <w:rPr>
+          <w:rFonts w:ascii="Garamond" w:hAnsi="Garamond"/>
+          <w:i/>
+          <w:iCs/>
+          <w:sz w:val="36"/>
+          <w:szCs w:val="36"/>
+        </w:rPr>
+        <w:t>Se o indivíduo alvejado não tem que perecer desse modo, o Espírito bondoso lhe inspirará a ideia de se desviar, ou então poderá</w:t>
+      </w:r>
+      <w:r>
+        <w:rPr>
+          <w:rFonts w:ascii="Garamond" w:hAnsi="Garamond"/>
+          <w:i/>
+          <w:iCs/>
+          <w:sz w:val="36"/>
+          <w:szCs w:val="36"/>
+        </w:rPr>
+        <w:t xml:space="preserve"> </w:t>
+      </w:r>
+      <w:r>
+        <w:rPr>
+          <w:rFonts w:ascii="Garamond" w:hAnsi="Garamond"/>
+          <w:i/>
+          <w:iCs/>
+          <w:sz w:val="36"/>
+          <w:szCs w:val="36"/>
+        </w:rPr>
+        <w:t>ofuscar o que empunha a arma, de sorte a fazê-lo apontar mal,porquanto, uma vez disparada a arma, o projetil segue a linha que</w:t>
+      </w:r>
+      <w:r>
+        <w:rPr>
+          <w:rFonts w:ascii="Garamond" w:hAnsi="Garamond"/>
+          <w:i/>
+          <w:iCs/>
+          <w:sz w:val="36"/>
+          <w:szCs w:val="36"/>
+        </w:rPr>
+        <w:t xml:space="preserve"> </w:t>
+      </w:r>
+      <w:r>
+        <w:rPr>
+          <w:rFonts w:ascii="Garamond" w:hAnsi="Garamond"/>
+          <w:i/>
+          <w:iCs/>
+          <w:sz w:val="36"/>
+          <w:szCs w:val="36"/>
+        </w:rPr>
+        <w:t>tem de percorrer.”</w:t>
+      </w:r>
+    </w:p>
+    <w:p>
+      <w:pPr>
+        <w:pStyle w:val="Normal"/>
+        <w:bidi w:val="0"/>
+        <w:ind w:left="709" w:hanging="0"/>
+        <w:jc w:val="both"/>
+        <w:rPr>
+          <w:rFonts w:ascii="Garamond" w:hAnsi="Garamond" w:eastAsia="Noto Serif CJK SC" w:cs="Noto Sans Devanagari"/>
+          <w:i w:val="false"/>
+          <w:i w:val="false"/>
+          <w:iCs w:val="false"/>
+          <w:color w:val="00A0FC"/>
+          <w:kern w:val="2"/>
+          <w:sz w:val="36"/>
+          <w:szCs w:val="36"/>
+          <w:lang w:val="pt-BR" w:eastAsia="zh-CN" w:bidi="hi-IN"/>
+        </w:rPr>
+      </w:pPr>
+      <w:r>
+        <w:rPr>
+          <w:rFonts w:eastAsia="Noto Serif CJK SC" w:cs="Noto Sans Devanagari" w:ascii="Garamond" w:hAnsi="Garamond"/>
+          <w:i w:val="false"/>
+          <w:iCs w:val="false"/>
+          <w:color w:val="00A0FC"/>
+          <w:kern w:val="2"/>
+          <w:sz w:val="36"/>
+          <w:szCs w:val="36"/>
+          <w:lang w:val="pt-BR" w:eastAsia="zh-CN" w:bidi="hi-IN"/>
+        </w:rPr>
+      </w:r>
+    </w:p>
+    <w:p>
+      <w:pPr>
+        <w:pStyle w:val="Normal"/>
+        <w:bidi w:val="0"/>
+        <w:ind w:left="709" w:hanging="0"/>
+        <w:jc w:val="both"/>
+        <w:rPr>
+          <w:rFonts w:ascii="Garamond" w:hAnsi="Garamond"/>
+          <w:color w:val="00A0FC"/>
+          <w:sz w:val="36"/>
+          <w:szCs w:val="36"/>
+        </w:rPr>
+      </w:pPr>
+      <w:r>
+        <w:rPr>
+          <w:rFonts w:eastAsia="Noto Serif CJK SC" w:cs="Noto Sans Devanagari" w:ascii="Garamond" w:hAnsi="Garamond"/>
+          <w:i w:val="false"/>
+          <w:iCs w:val="false"/>
+          <w:color w:val="00A0FC"/>
+          <w:kern w:val="2"/>
+          <w:sz w:val="36"/>
+          <w:szCs w:val="36"/>
+          <w:lang w:val="pt-BR" w:eastAsia="zh-CN" w:bidi="hi-IN"/>
+        </w:rPr>
+        <w:t>P</w:t>
+      </w:r>
+      <w:r>
+        <w:rPr>
+          <w:rFonts w:eastAsia="Noto Serif CJK SC" w:cs="Noto Sans Devanagari" w:ascii="Garamond" w:hAnsi="Garamond"/>
+          <w:i w:val="false"/>
+          <w:iCs w:val="false"/>
+          <w:color w:val="00A0FC"/>
+          <w:kern w:val="2"/>
+          <w:sz w:val="36"/>
+          <w:szCs w:val="36"/>
+          <w:lang w:val="pt-BR" w:eastAsia="zh-CN" w:bidi="hi-IN"/>
+        </w:rPr>
+        <w:t xml:space="preserve">rosseguir daqui. xxxxxxxxxxx xx xxx x  xxx xx  xxxx x x xxxxxx xxxxxx xxxxx xxx xxx xx xx </w:t>
+      </w:r>
+    </w:p>
+    <w:p>
+      <w:pPr>
+        <w:pStyle w:val="Normal"/>
+        <w:bidi w:val="0"/>
+        <w:ind w:left="709" w:hanging="0"/>
+        <w:jc w:val="both"/>
+        <w:rPr>
+          <w:rFonts w:ascii="Garamond" w:hAnsi="Garamond" w:eastAsia="Noto Serif CJK SC" w:cs="Noto Sans Devanagari"/>
+          <w:color w:val="00A0FC"/>
+          <w:kern w:val="2"/>
+          <w:sz w:val="36"/>
+          <w:szCs w:val="36"/>
+          <w:lang w:val="pt-BR" w:eastAsia="zh-CN" w:bidi="hi-IN"/>
+        </w:rPr>
+      </w:pPr>
+      <w:r>
+        <w:rPr/>
+      </w:r>
+    </w:p>
+    <w:p>
+      <w:pPr>
+        <w:pStyle w:val="Normal"/>
+        <w:bidi w:val="0"/>
+        <w:ind w:left="709" w:hanging="0"/>
+        <w:jc w:val="both"/>
+        <w:rPr>
+          <w:rFonts w:ascii="Garamond" w:hAnsi="Garamond" w:eastAsia="Noto Serif CJK SC" w:cs="Noto Sans Devanagari"/>
+          <w:color w:val="00A0FC"/>
+          <w:kern w:val="2"/>
+          <w:sz w:val="36"/>
+          <w:szCs w:val="36"/>
+          <w:lang w:val="pt-BR" w:eastAsia="zh-CN" w:bidi="hi-IN"/>
+        </w:rPr>
+      </w:pPr>
+      <w:r>
+        <w:rPr/>
+      </w:r>
+    </w:p>
+    <w:p>
+      <w:pPr>
+        <w:pStyle w:val="Normal"/>
+        <w:bidi w:val="0"/>
+        <w:ind w:left="709" w:hanging="0"/>
+        <w:jc w:val="both"/>
+        <w:rPr>
+          <w:rFonts w:ascii="Garamond" w:hAnsi="Garamond" w:eastAsia="Noto Serif CJK SC" w:cs="Noto Sans Devanagari"/>
+          <w:color w:val="00A0FC"/>
+          <w:kern w:val="2"/>
+          <w:sz w:val="36"/>
+          <w:szCs w:val="36"/>
+          <w:lang w:val="pt-BR" w:eastAsia="zh-CN" w:bidi="hi-IN"/>
+        </w:rPr>
+      </w:pPr>
+      <w:r>
+        <w:rPr/>
+      </w:r>
+    </w:p>
+    <w:p>
+      <w:pPr>
+        <w:pStyle w:val="Normal"/>
+        <w:bidi w:val="0"/>
+        <w:ind w:left="709" w:hanging="0"/>
+        <w:jc w:val="both"/>
+        <w:rPr>
+          <w:rFonts w:ascii="Garamond" w:hAnsi="Garamond"/>
+          <w:color w:val="00A0FC"/>
+          <w:sz w:val="36"/>
+          <w:szCs w:val="36"/>
+        </w:rPr>
+      </w:pPr>
+      <w:r>
+        <w:rPr>
+          <w:rFonts w:ascii="Garamond" w:hAnsi="Garamond"/>
+          <w:color w:val="00A0FC"/>
+          <w:sz w:val="36"/>
+          <w:szCs w:val="36"/>
+        </w:rPr>
+      </w:r>
+    </w:p>
+    <w:p>
+      <w:pPr>
+        <w:pStyle w:val="Normal"/>
+        <w:bidi w:val="0"/>
+        <w:ind w:hanging="0"/>
+        <w:jc w:val="both"/>
+        <w:rPr/>
+      </w:pPr>
+      <w:r>
+        <w:rPr/>
+        <w:tab/>
       </w:r>
     </w:p>
     <w:p>
@@ -5708,7 +7636,7 @@
     <w:pPr>
       <w:widowControl/>
       <w:suppressAutoHyphens w:val="true"/>
-      <w:overflowPunct w:val="true"/>
+      <w:overflowPunct w:val="false"/>
       <w:bidi w:val="0"/>
       <w:spacing w:before="0" w:after="0"/>
       <w:jc w:val="left"/>

</xml_diff>